<commit_message>
Updated setup instructions for v5.13.0
</commit_message>
<xml_diff>
--- a/docs/Biosum_Setup_Instructions.docx
+++ b/docs/Biosum_Setup_Instructions.docx
@@ -1,6 +1,6 @@
 
 <file path=word/document.xml><?xml version="1.0" encoding="utf-8"?>
-<w:document xmlns:wpc="http://schemas.microsoft.com/office/word/2010/wordprocessingCanvas" xmlns:cx="http://schemas.microsoft.com/office/drawing/2014/chartex" xmlns:cx1="http://schemas.microsoft.com/office/drawing/2015/9/8/chartex" xmlns:cx2="http://schemas.microsoft.com/office/drawing/2015/10/21/chartex" xmlns:cx3="http://schemas.microsoft.com/office/drawing/2016/5/9/chartex" xmlns:cx4="http://schemas.microsoft.com/office/drawing/2016/5/10/chartex" xmlns:cx5="http://schemas.microsoft.com/office/drawing/2016/5/11/chartex" xmlns:cx6="http://schemas.microsoft.com/office/drawing/2016/5/12/chartex" xmlns:cx7="http://schemas.microsoft.com/office/drawing/2016/5/13/chartex" xmlns:cx8="http://schemas.microsoft.com/office/drawing/2016/5/14/chartex" xmlns:mc="http://schemas.openxmlformats.org/markup-compatibility/2006" xmlns:aink="http://schemas.microsoft.com/office/drawing/2016/ink" xmlns:am3d="http://schemas.microsoft.com/office/drawing/2017/model3d" xmlns:o="urn:schemas-microsoft-com:office:office" xmlns:oel="http://schemas.microsoft.com/office/2019/extlst" xmlns:r="http://schemas.openxmlformats.org/officeDocument/2006/relationships" xmlns:m="http://schemas.openxmlformats.org/officeDocument/2006/math" xmlns:v="urn:schemas-microsoft-com:vml" xmlns:wp14="http://schemas.microsoft.com/office/word/2010/wordprocessingDrawing" xmlns:wp="http://schemas.openxmlformats.org/drawingml/2006/wordprocessingDrawing" xmlns:w10="urn:schemas-microsoft-com:office:word" xmlns:w="http://schemas.openxmlformats.org/wordprocessingml/2006/main" xmlns:w14="http://schemas.microsoft.com/office/word/2010/wordml" xmlns:w15="http://schemas.microsoft.com/office/word/2012/wordml" xmlns:w16cex="http://schemas.microsoft.com/office/word/2018/wordml/cex" xmlns:w16cid="http://schemas.microsoft.com/office/word/2016/wordml/cid" xmlns:w16="http://schemas.microsoft.com/office/word/2018/wordml" xmlns:w16du="http://schemas.microsoft.com/office/word/2023/wordml/word16du" xmlns:w16sdtdh="http://schemas.microsoft.com/office/word/2020/wordml/sdtdatahash" xmlns:w16se="http://schemas.microsoft.com/office/word/2015/wordml/symex" xmlns:wpg="http://schemas.microsoft.com/office/word/2010/wordprocessingGroup" xmlns:wpi="http://schemas.microsoft.com/office/word/2010/wordprocessingInk" xmlns:wne="http://schemas.microsoft.com/office/word/2006/wordml" xmlns:wps="http://schemas.microsoft.com/office/word/2010/wordprocessingShape" mc:Ignorable="w14 w15 w16se w16cid w16 w16cex w16sdtdh w16du wp14">
+<w:document xmlns:wpc="http://schemas.microsoft.com/office/word/2010/wordprocessingCanvas" xmlns:cx="http://schemas.microsoft.com/office/drawing/2014/chartex" xmlns:cx1="http://schemas.microsoft.com/office/drawing/2015/9/8/chartex" xmlns:cx2="http://schemas.microsoft.com/office/drawing/2015/10/21/chartex" xmlns:cx3="http://schemas.microsoft.com/office/drawing/2016/5/9/chartex" xmlns:cx4="http://schemas.microsoft.com/office/drawing/2016/5/10/chartex" xmlns:cx5="http://schemas.microsoft.com/office/drawing/2016/5/11/chartex" xmlns:cx6="http://schemas.microsoft.com/office/drawing/2016/5/12/chartex" xmlns:cx7="http://schemas.microsoft.com/office/drawing/2016/5/13/chartex" xmlns:cx8="http://schemas.microsoft.com/office/drawing/2016/5/14/chartex" xmlns:mc="http://schemas.openxmlformats.org/markup-compatibility/2006" xmlns:aink="http://schemas.microsoft.com/office/drawing/2016/ink" xmlns:am3d="http://schemas.microsoft.com/office/drawing/2017/model3d" xmlns:o="urn:schemas-microsoft-com:office:office" xmlns:r="http://schemas.openxmlformats.org/officeDocument/2006/relationships" xmlns:m="http://schemas.openxmlformats.org/officeDocument/2006/math" xmlns:v="urn:schemas-microsoft-com:vml" xmlns:wp14="http://schemas.microsoft.com/office/word/2010/wordprocessingDrawing" xmlns:wp="http://schemas.openxmlformats.org/drawingml/2006/wordprocessingDrawing" xmlns:w10="urn:schemas-microsoft-com:office:word" xmlns:w="http://schemas.openxmlformats.org/wordprocessingml/2006/main" xmlns:w14="http://schemas.microsoft.com/office/word/2010/wordml" xmlns:w15="http://schemas.microsoft.com/office/word/2012/wordml" xmlns:w16cex="http://schemas.microsoft.com/office/word/2018/wordml/cex" xmlns:w16cid="http://schemas.microsoft.com/office/word/2016/wordml/cid" xmlns:w16="http://schemas.microsoft.com/office/word/2018/wordml" xmlns:w16sdtdh="http://schemas.microsoft.com/office/word/2020/wordml/sdtdatahash" xmlns:w16se="http://schemas.microsoft.com/office/word/2015/wordml/symex" xmlns:wpg="http://schemas.microsoft.com/office/word/2010/wordprocessingGroup" xmlns:wpi="http://schemas.microsoft.com/office/word/2010/wordprocessingInk" xmlns:wne="http://schemas.microsoft.com/office/word/2006/wordml" xmlns:wps="http://schemas.microsoft.com/office/word/2010/wordprocessingShape" mc:Ignorable="w14 w15 w16se w16cid w16 w16cex w16sdtdh wp14">
   <w:body>
     <w:p>
       <w:pPr>
@@ -105,8 +105,18 @@
           <w:sz w:val="52"/>
           <w:szCs w:val="52"/>
         </w:rPr>
-        <w:t>FIA Biosum</w:t>
-      </w:r>
+        <w:t xml:space="preserve">FIA </w:t>
+      </w:r>
+      <w:proofErr w:type="spellStart"/>
+      <w:r>
+        <w:rPr>
+          <w:b/>
+          <w:sz w:val="52"/>
+          <w:szCs w:val="52"/>
+        </w:rPr>
+        <w:t>Biosum</w:t>
+      </w:r>
+      <w:proofErr w:type="spellEnd"/>
       <w:r>
         <w:rPr>
           <w:b/>
@@ -417,31 +427,31 @@
         <w:rPr>
           <w:b/>
         </w:rPr>
-        <w:t>1</w:t>
+        <w:t>13.0</w:t>
       </w:r>
       <w:r>
         <w:rPr>
           <w:b/>
         </w:rPr>
-        <w:t>1</w:t>
+        <w:t>,</w:t>
       </w:r>
       <w:r>
         <w:rPr>
           <w:b/>
         </w:rPr>
-        <w:t>.</w:t>
+        <w:t xml:space="preserve"> </w:t>
       </w:r>
       <w:r>
         <w:rPr>
           <w:b/>
         </w:rPr>
-        <w:t>1</w:t>
+        <w:t xml:space="preserve">released </w:t>
       </w:r>
       <w:r>
         <w:rPr>
           <w:b/>
         </w:rPr>
-        <w:t>,</w:t>
+        <w:t>in April</w:t>
       </w:r>
       <w:r>
         <w:rPr>
@@ -453,19 +463,13 @@
         <w:rPr>
           <w:b/>
         </w:rPr>
-        <w:t xml:space="preserve">released on </w:t>
+        <w:t>202</w:t>
       </w:r>
       <w:r>
         <w:rPr>
           <w:b/>
         </w:rPr>
-        <w:t>12</w:t>
-      </w:r>
-      <w:r>
-        <w:rPr>
-          <w:b/>
-        </w:rPr>
-        <w:t xml:space="preserve"> November 2024</w:t>
+        <w:t>6</w:t>
       </w:r>
       <w:r>
         <w:rPr>
@@ -504,7 +508,6 @@
           <w:sz w:val="28"/>
           <w:szCs w:val="28"/>
         </w:rPr>
-        <w:lastRenderedPageBreak/>
         <w:t>Introduction</w:t>
       </w:r>
     </w:p>
@@ -532,24 +535,44 @@
         <w:t xml:space="preserve">This guide details the </w:t>
       </w:r>
       <w:r>
-        <w:t xml:space="preserve">22 </w:t>
-      </w:r>
-      <w:r>
-        <w:t xml:space="preserve">steps required to install FIA BioSum </w:t>
-      </w:r>
-      <w:r>
-        <w:t xml:space="preserve">version 5.11.1 </w:t>
-      </w:r>
-      <w:r>
-        <w:t xml:space="preserve">software on your </w:t>
+        <w:t>2</w:t>
+      </w:r>
+      <w:r>
+        <w:t>1</w:t>
+      </w:r>
+      <w:r>
+        <w:t xml:space="preserve"> </w:t>
+      </w:r>
+      <w:r>
+        <w:t xml:space="preserve">steps required to install FIA </w:t>
+      </w:r>
+      <w:proofErr w:type="spellStart"/>
+      <w:r>
+        <w:t>BioSum</w:t>
+      </w:r>
+      <w:proofErr w:type="spellEnd"/>
+      <w:r>
+        <w:t xml:space="preserve"> </w:t>
+      </w:r>
+      <w:r>
+        <w:t>version 5.</w:t>
+      </w:r>
+      <w:r>
+        <w:t>13.0</w:t>
+      </w:r>
+      <w:r>
+        <w:t xml:space="preserve"> </w:t>
+      </w:r>
+      <w:r>
+        <w:t xml:space="preserve">software on your Windows </w:t>
       </w:r>
       <w:proofErr w:type="gramStart"/>
       <w:r>
-        <w:t>Windows</w:t>
+        <w:t>computer</w:t>
       </w:r>
       <w:proofErr w:type="gramEnd"/>
       <w:r>
-        <w:t xml:space="preserve"> computer for the first time</w:t>
+        <w:t xml:space="preserve"> for the first time</w:t>
       </w:r>
       <w:r>
         <w:t>—what we call a “full installation”</w:t>
@@ -561,10 +584,24 @@
         <w:t>If</w:t>
       </w:r>
       <w:r>
-        <w:t xml:space="preserve"> upgrading from a version of BioSum </w:t>
-      </w:r>
-      <w:r>
-        <w:t>earlier than 5.10.1, there are many considerations to work through and you are advised contact the developers before attempting an upgrade.</w:t>
+        <w:t xml:space="preserve"> upgrading from a version of </w:t>
+      </w:r>
+      <w:proofErr w:type="spellStart"/>
+      <w:r>
+        <w:t>BioSum</w:t>
+      </w:r>
+      <w:proofErr w:type="spellEnd"/>
+      <w:r>
+        <w:t xml:space="preserve"> </w:t>
+      </w:r>
+      <w:r>
+        <w:t>earlier than 5.1</w:t>
+      </w:r>
+      <w:r>
+        <w:t>2.1</w:t>
+      </w:r>
+      <w:r>
+        <w:t>, there are many considerations to work through and you are advised contact the developers before attempting an upgrade.</w:t>
       </w:r>
       <w:r>
         <w:t xml:space="preserve"> </w:t>
@@ -593,21 +630,23 @@
         </w:rPr>
         <w:t xml:space="preserve">from a </w:t>
       </w:r>
+      <w:proofErr w:type="spellStart"/>
       <w:r>
         <w:rPr>
           <w:b/>
           <w:bCs/>
           <w:u w:val="single"/>
         </w:rPr>
-        <w:t xml:space="preserve">BioSum </w:t>
-      </w:r>
+        <w:t>BioSum</w:t>
+      </w:r>
+      <w:proofErr w:type="spellEnd"/>
       <w:r>
         <w:rPr>
           <w:b/>
           <w:bCs/>
           <w:u w:val="single"/>
         </w:rPr>
-        <w:t xml:space="preserve">version earlier than </w:t>
+        <w:t xml:space="preserve"> </w:t>
       </w:r>
       <w:r>
         <w:rPr>
@@ -615,7 +654,7 @@
           <w:bCs/>
           <w:u w:val="single"/>
         </w:rPr>
-        <w:t>5.8.9</w:t>
+        <w:t xml:space="preserve">version earlier than </w:t>
       </w:r>
       <w:r>
         <w:rPr>
@@ -623,7 +662,7 @@
           <w:bCs/>
           <w:u w:val="single"/>
         </w:rPr>
-        <w:t xml:space="preserve"> </w:t>
+        <w:t>5.8.9</w:t>
       </w:r>
       <w:r>
         <w:rPr>
@@ -631,7 +670,33 @@
           <w:bCs/>
           <w:u w:val="single"/>
         </w:rPr>
-        <w:t>as BioSum transition</w:t>
+        <w:t xml:space="preserve"> </w:t>
+      </w:r>
+      <w:r>
+        <w:rPr>
+          <w:b/>
+          <w:bCs/>
+          <w:u w:val="single"/>
+        </w:rPr>
+        <w:t xml:space="preserve">as </w:t>
+      </w:r>
+      <w:proofErr w:type="spellStart"/>
+      <w:r>
+        <w:rPr>
+          <w:b/>
+          <w:bCs/>
+          <w:u w:val="single"/>
+        </w:rPr>
+        <w:t>BioSum</w:t>
+      </w:r>
+      <w:proofErr w:type="spellEnd"/>
+      <w:r>
+        <w:rPr>
+          <w:b/>
+          <w:bCs/>
+          <w:u w:val="single"/>
+        </w:rPr>
+        <w:t xml:space="preserve"> transition</w:t>
       </w:r>
       <w:r>
         <w:rPr>
@@ -693,8 +758,13 @@
         </w:tabs>
         <w:ind w:left="720" w:right="720"/>
       </w:pPr>
-      <w:r>
-        <w:t xml:space="preserve">BioSum </w:t>
+      <w:proofErr w:type="spellStart"/>
+      <w:r>
+        <w:t>BioSum</w:t>
+      </w:r>
+      <w:proofErr w:type="spellEnd"/>
+      <w:r>
+        <w:t xml:space="preserve"> </w:t>
       </w:r>
       <w:r>
         <w:t xml:space="preserve">should be installed </w:t>
@@ -712,40 +782,7 @@
         <w:t xml:space="preserve">to be run from </w:t>
       </w:r>
       <w:r>
-        <w:t xml:space="preserve">any user account on the computer. It is also </w:t>
-      </w:r>
-      <w:r>
-        <w:t>essential</w:t>
-      </w:r>
-      <w:r>
-        <w:t xml:space="preserve"> that BioSum </w:t>
-      </w:r>
-      <w:r>
-        <w:t>“</w:t>
-      </w:r>
-      <w:r>
-        <w:t>projects</w:t>
-      </w:r>
-      <w:r>
-        <w:t>”, the datasets assembled and analyzed during the BioSum workflow,</w:t>
-      </w:r>
-      <w:r>
-        <w:t xml:space="preserve"> be in “trusted locations” as defined in the </w:t>
-      </w:r>
-      <w:r>
-        <w:t xml:space="preserve">MS Access configuration to eliminate </w:t>
-      </w:r>
-      <w:r>
-        <w:t xml:space="preserve">disk </w:t>
-      </w:r>
-      <w:r>
-        <w:t xml:space="preserve">write </w:t>
-      </w:r>
-      <w:r>
-        <w:t>failures</w:t>
-      </w:r>
-      <w:r>
-        <w:t xml:space="preserve"> in a project’s database. </w:t>
+        <w:t xml:space="preserve">any user account on the computer. </w:t>
       </w:r>
     </w:p>
     <w:p>
@@ -770,15 +807,7 @@
         <w:t>full administrative account access is not available</w:t>
       </w:r>
       <w:r>
-        <w:t xml:space="preserve"> to most </w:t>
-      </w:r>
-      <w:proofErr w:type="gramStart"/>
-      <w:r>
-        <w:t>users</w:t>
-      </w:r>
-      <w:proofErr w:type="gramEnd"/>
-      <w:r>
-        <w:t xml:space="preserve"> and it will be necessary to have the FS Customer Help Desk perform the installation</w:t>
+        <w:t xml:space="preserve"> to most users and it will be necessary to have the FS Customer Help Desk perform the installation</w:t>
       </w:r>
       <w:r>
         <w:t xml:space="preserve">. </w:t>
@@ -914,8 +943,13 @@
       <w:r>
         <w:t xml:space="preserve">the </w:t>
       </w:r>
-      <w:r>
-        <w:t xml:space="preserve">RSQLite </w:t>
+      <w:proofErr w:type="spellStart"/>
+      <w:r>
+        <w:t>RSQLite</w:t>
+      </w:r>
+      <w:proofErr w:type="spellEnd"/>
+      <w:r>
+        <w:t xml:space="preserve"> </w:t>
       </w:r>
       <w:r>
         <w:t>package</w:t>
@@ -936,10 +970,26 @@
         <w:ind w:right="720"/>
       </w:pPr>
       <w:r>
-        <w:t>Install FIA Biosum Manager</w:t>
-      </w:r>
-      <w:r>
-        <w:t>—the analyst-friendly software that manages workflow associated with the many data manipulation and analysis procedures in a BioSum project</w:t>
+        <w:t xml:space="preserve">Install FIA </w:t>
+      </w:r>
+      <w:proofErr w:type="spellStart"/>
+      <w:r>
+        <w:t>Biosum</w:t>
+      </w:r>
+      <w:proofErr w:type="spellEnd"/>
+      <w:r>
+        <w:t xml:space="preserve"> Manager</w:t>
+      </w:r>
+      <w:r>
+        <w:t xml:space="preserve">—the analyst-friendly software that manages workflow associated with the many data manipulation and analysis procedures in a </w:t>
+      </w:r>
+      <w:proofErr w:type="spellStart"/>
+      <w:r>
+        <w:t>BioSum</w:t>
+      </w:r>
+      <w:proofErr w:type="spellEnd"/>
+      <w:r>
+        <w:t xml:space="preserve"> project</w:t>
       </w:r>
       <w:r>
         <w:t>.</w:t>
@@ -987,7 +1037,6 @@
           <w:sz w:val="28"/>
           <w:szCs w:val="28"/>
         </w:rPr>
-        <w:lastRenderedPageBreak/>
         <w:t>Software Requirements</w:t>
       </w:r>
       <w:r>
@@ -996,8 +1045,18 @@
           <w:sz w:val="28"/>
           <w:szCs w:val="28"/>
         </w:rPr>
-        <w:t xml:space="preserve"> for Computers Running BioSum</w:t>
-      </w:r>
+        <w:t xml:space="preserve"> for Computers Running </w:t>
+      </w:r>
+      <w:proofErr w:type="spellStart"/>
+      <w:r>
+        <w:rPr>
+          <w:b/>
+          <w:sz w:val="28"/>
+          <w:szCs w:val="28"/>
+        </w:rPr>
+        <w:t>BioSum</w:t>
+      </w:r>
+      <w:proofErr w:type="spellEnd"/>
     </w:p>
     <w:p>
       <w:pPr>
@@ -1015,22 +1074,36 @@
         <w:ind w:left="720" w:right="720"/>
       </w:pPr>
       <w:r>
-        <w:t>For BioSum to install and f</w:t>
-      </w:r>
-      <w:r>
-        <w:t>unction at all, requirements 1-</w:t>
+        <w:t xml:space="preserve">For </w:t>
+      </w:r>
+      <w:proofErr w:type="spellStart"/>
+      <w:r>
+        <w:t>BioSum</w:t>
+      </w:r>
+      <w:proofErr w:type="spellEnd"/>
+      <w:r>
+        <w:t xml:space="preserve"> to install and f</w:t>
+      </w:r>
+      <w:r>
+        <w:t>unction at all, requirement 1</w:t>
+      </w:r>
+      <w:r>
+        <w:t xml:space="preserve"> </w:t>
+      </w:r>
+      <w:r>
+        <w:t>m</w:t>
+      </w:r>
+      <w:r>
+        <w:t>ust already be met. Requirement</w:t>
+      </w:r>
+      <w:r>
+        <w:t>s 2 and</w:t>
+      </w:r>
+      <w:r>
+        <w:t xml:space="preserve"> </w:t>
       </w:r>
       <w:r>
         <w:t>3</w:t>
-      </w:r>
-      <w:r>
-        <w:t xml:space="preserve"> m</w:t>
-      </w:r>
-      <w:r>
-        <w:t xml:space="preserve">ust already be met. Requirement </w:t>
-      </w:r>
-      <w:r>
-        <w:t>4</w:t>
       </w:r>
       <w:r>
         <w:t xml:space="preserve"> can be met following installation</w:t>
@@ -1059,10 +1132,13 @@
         <w:ind w:right="720"/>
       </w:pPr>
       <w:r>
-        <w:t>Microsoft Windows 7 Professional, Enterprise, or Ultimate editions</w:t>
-      </w:r>
-      <w:r>
-        <w:t>, or Windows 10</w:t>
+        <w:t xml:space="preserve">Microsoft Windows </w:t>
+      </w:r>
+      <w:r>
+        <w:t xml:space="preserve">11 </w:t>
+      </w:r>
+      <w:r>
+        <w:t>or Windows 10</w:t>
       </w:r>
       <w:r>
         <w:t>.</w:t>
@@ -1080,160 +1156,51 @@
         <w:ind w:right="720"/>
       </w:pPr>
       <w:r>
-        <w:t xml:space="preserve">Microsoft Office </w:t>
-      </w:r>
-      <w:r>
-        <w:t>201</w:t>
-      </w:r>
-      <w:r>
-        <w:t>6</w:t>
-      </w:r>
-      <w:r>
-        <w:t xml:space="preserve"> or greater (through Office 365)</w:t>
-      </w:r>
-      <w:r>
-        <w:t xml:space="preserve">, </w:t>
-      </w:r>
-      <w:r>
-        <w:t xml:space="preserve">which BioSum uses for data storage, </w:t>
-      </w:r>
-      <w:r>
-        <w:t xml:space="preserve">but </w:t>
-      </w:r>
-      <w:r>
-        <w:rPr>
-          <w:b/>
-          <w:u w:val="single"/>
-        </w:rPr>
-        <w:t>must be</w:t>
-      </w:r>
-      <w:r>
-        <w:t xml:space="preserve"> </w:t>
-      </w:r>
-      <w:r>
-        <w:rPr>
-          <w:u w:val="single"/>
-        </w:rPr>
-        <w:t>64-</w:t>
-      </w:r>
-      <w:r>
-        <w:rPr>
-          <w:u w:val="single"/>
-        </w:rPr>
-        <w:t>bit Version</w:t>
-      </w:r>
-      <w:r>
-        <w:t xml:space="preserve"> </w:t>
-      </w:r>
-      <w:r>
-        <w:t xml:space="preserve">and include MS </w:t>
-      </w:r>
-      <w:r>
-        <w:t>Access.</w:t>
-      </w:r>
-      <w:r>
-        <w:t xml:space="preserve"> </w:t>
-      </w:r>
-      <w:r>
-        <w:rPr>
-          <w:b/>
-          <w:bCs/>
-        </w:rPr>
-        <w:t>IMPORTANT:</w:t>
-      </w:r>
-      <w:r>
-        <w:rPr>
-          <w:b/>
-          <w:bCs/>
-        </w:rPr>
-        <w:t xml:space="preserve"> </w:t>
-      </w:r>
-      <w:r>
-        <w:rPr>
-          <w:b/>
-          <w:bCs/>
-        </w:rPr>
-        <w:t>Microsoft Access Database Engine 2016 64-bit Redistributable, a “</w:t>
-      </w:r>
-      <w:r>
-        <w:rPr>
-          <w:b/>
-          <w:bCs/>
-        </w:rPr>
-        <w:t>runtime library</w:t>
-      </w:r>
-      <w:r>
-        <w:rPr>
-          <w:b/>
-          <w:bCs/>
-        </w:rPr>
-        <w:t>”</w:t>
-      </w:r>
-      <w:r>
-        <w:rPr>
-          <w:b/>
-          <w:bCs/>
-        </w:rPr>
-        <w:t xml:space="preserve"> </w:t>
-      </w:r>
-      <w:r>
-        <w:rPr>
-          <w:b/>
-          <w:bCs/>
-        </w:rPr>
-        <w:t>that allows non-Microsoft applications like BioSum to interact with MS Access databases, must also be installed</w:t>
-      </w:r>
-      <w:r>
-        <w:t>. This redistributable, ‘</w:t>
-      </w:r>
-      <w:r>
-        <w:t>accessdatabaseengine_</w:t>
-      </w:r>
-      <w:r>
-        <w:rPr>
-          <w:b/>
-          <w:bCs/>
-        </w:rPr>
-        <w:t>X64</w:t>
-      </w:r>
-      <w:r>
-        <w:t>.exe</w:t>
-      </w:r>
-      <w:r>
-        <w:t xml:space="preserve">’, can be downloaded from </w:t>
-      </w:r>
-      <w:bookmarkStart w:id="0" w:name="_Hlk183615612"/>
-      <w:r>
-        <w:t>https://www.microsoft.com/en-us/download/details.aspx?id=54920</w:t>
-      </w:r>
-      <w:bookmarkEnd w:id="0"/>
-      <w:r>
-        <w:t xml:space="preserve">, </w:t>
-      </w:r>
-      <w:r>
-        <w:t xml:space="preserve">and then </w:t>
-      </w:r>
-      <w:r>
-        <w:t>install</w:t>
-      </w:r>
-      <w:r>
-        <w:t>ed</w:t>
-      </w:r>
-      <w:r>
-        <w:t xml:space="preserve"> </w:t>
-      </w:r>
-      <w:r>
-        <w:t xml:space="preserve">with </w:t>
-      </w:r>
-      <w:r>
-        <w:t xml:space="preserve">admin </w:t>
-      </w:r>
-      <w:r>
-        <w:t>privileges</w:t>
-      </w:r>
-      <w:r>
-        <w:t xml:space="preserve"> (FS users may need help from the Customer Help Desk)</w:t>
-      </w:r>
+        <w:t xml:space="preserve">If wanting to run ad-hoc queries in MS Access, </w:t>
+      </w:r>
+      <w:r>
+        <w:t xml:space="preserve">64-bit SQLite ODBC driver: Forest </w:t>
+      </w:r>
+      <w:r>
+        <w:t>S</w:t>
+      </w:r>
+      <w:r>
+        <w:t xml:space="preserve">ervice users can install </w:t>
+      </w:r>
+      <w:r>
+        <w:t xml:space="preserve">this driver </w:t>
+      </w:r>
+      <w:r>
+        <w:t>from the Software Center</w:t>
+      </w:r>
+      <w:r>
+        <w:t xml:space="preserve"> (making sure they are downloading the </w:t>
+      </w:r>
+      <w:proofErr w:type="gramStart"/>
+      <w:r>
+        <w:t>64 bit</w:t>
+      </w:r>
+      <w:proofErr w:type="gramEnd"/>
+      <w:r>
+        <w:t xml:space="preserve"> version)</w:t>
+      </w:r>
+      <w:r>
+        <w:t xml:space="preserve">. All other users should download </w:t>
+      </w:r>
+      <w:r>
+        <w:t xml:space="preserve">it </w:t>
+      </w:r>
+      <w:r>
+        <w:t xml:space="preserve">from </w:t>
+      </w:r>
+      <w:hyperlink r:id="rId9" w:history="1">
+        <w:r>
+          <w:rPr>
+            <w:rStyle w:val="Hyperlink"/>
+          </w:rPr>
+          <w:t>http://www.ch-werner.de/sqliteodbc/</w:t>
+        </w:r>
+      </w:hyperlink>
       <w:r>
         <w:t>.</w:t>
       </w:r>
@@ -1250,70 +1217,12 @@
         <w:ind w:right="720"/>
       </w:pPr>
       <w:r>
-        <w:t xml:space="preserve">64-bit SQLite ODBC driver: Forest </w:t>
-      </w:r>
-      <w:r>
-        <w:t>S</w:t>
-      </w:r>
-      <w:r>
-        <w:t xml:space="preserve">ervice users can install </w:t>
-      </w:r>
-      <w:r>
-        <w:t xml:space="preserve">this driver </w:t>
-      </w:r>
-      <w:r>
-        <w:t>from the Software Center</w:t>
-      </w:r>
-      <w:r>
-        <w:t xml:space="preserve"> (making sure they are downloading the </w:t>
-      </w:r>
-      <w:proofErr w:type="gramStart"/>
-      <w:r>
-        <w:t>64 bit</w:t>
-      </w:r>
-      <w:proofErr w:type="gramEnd"/>
-      <w:r>
-        <w:t xml:space="preserve"> version)</w:t>
-      </w:r>
-      <w:r>
-        <w:t xml:space="preserve">. All other users should download </w:t>
-      </w:r>
-      <w:r>
-        <w:t xml:space="preserve">it </w:t>
-      </w:r>
-      <w:r>
-        <w:t xml:space="preserve">from </w:t>
-      </w:r>
-      <w:hyperlink r:id="rId9" w:history="1">
-        <w:r>
-          <w:rPr>
-            <w:rStyle w:val="Hyperlink"/>
-          </w:rPr>
-          <w:t>http://www.ch-werner.de/sqliteodbc/</w:t>
-        </w:r>
-      </w:hyperlink>
-      <w:r>
-        <w:t>.</w:t>
-      </w:r>
-    </w:p>
-    <w:p>
-      <w:pPr>
-        <w:numPr>
-          <w:ilvl w:val="0"/>
-          <w:numId w:val="2"/>
-        </w:numPr>
-        <w:tabs>
-          <w:tab w:val="left" w:pos="720"/>
-        </w:tabs>
-        <w:ind w:right="720"/>
-      </w:pPr>
-      <w:r>
         <w:t>A</w:t>
       </w:r>
       <w:r>
         <w:t xml:space="preserve"> </w:t>
       </w:r>
-      <w:bookmarkStart w:id="1" w:name="_Hlk183615706"/>
+      <w:bookmarkStart w:id="0" w:name="_Hlk183615706"/>
       <w:r>
         <w:t>Java SDK (v1.8 or later</w:t>
       </w:r>
@@ -1323,9 +1232,17 @@
       <w:r>
         <w:t>)</w:t>
       </w:r>
-      <w:bookmarkEnd w:id="1"/>
-      <w:r>
-        <w:t>. BioSum has been tested with both the Oracle SDK and OpenJDK. Forest Service users should</w:t>
+      <w:bookmarkEnd w:id="0"/>
+      <w:r>
+        <w:t xml:space="preserve">. </w:t>
+      </w:r>
+      <w:proofErr w:type="spellStart"/>
+      <w:r>
+        <w:t>BioSum</w:t>
+      </w:r>
+      <w:proofErr w:type="spellEnd"/>
+      <w:r>
+        <w:t xml:space="preserve"> has been tested with both the Oracle SDK and OpenJDK. Forest Service users should</w:t>
       </w:r>
       <w:r>
         <w:t xml:space="preserve"> install/</w:t>
@@ -1339,8 +1256,13 @@
       <w:r>
         <w:t xml:space="preserve">If a Java SDK has already been installed via procedures consistent with those specified in this guide, there is no need to reinstall this component. </w:t>
       </w:r>
-      <w:r>
-        <w:t xml:space="preserve">BioSum has </w:t>
+      <w:proofErr w:type="spellStart"/>
+      <w:r>
+        <w:t>BioSum</w:t>
+      </w:r>
+      <w:proofErr w:type="spellEnd"/>
+      <w:r>
+        <w:t xml:space="preserve"> has </w:t>
       </w:r>
       <w:r>
         <w:rPr>
@@ -1417,7 +1339,6 @@
         <w:tc>
           <w:tcPr>
             <w:tcW w:w="10041" w:type="dxa"/>
-            <w:shd w:val="clear" w:color="auto" w:fill="auto"/>
           </w:tcPr>
           <w:p>
             <w:pPr>
@@ -1471,8 +1392,17 @@
                 <w:rFonts w:ascii="Times New Roman" w:hAnsi="Times New Roman" w:cs="Times New Roman"/>
                 <w:color w:val="auto"/>
               </w:rPr>
-              <w:t>se instructions will get you up and running with BioSum</w:t>
-            </w:r>
+              <w:t xml:space="preserve">se instructions will get you up and running with </w:t>
+            </w:r>
+            <w:proofErr w:type="spellStart"/>
+            <w:r>
+              <w:rPr>
+                <w:rFonts w:ascii="Times New Roman" w:hAnsi="Times New Roman" w:cs="Times New Roman"/>
+                <w:color w:val="auto"/>
+              </w:rPr>
+              <w:t>BioSum</w:t>
+            </w:r>
+            <w:proofErr w:type="spellEnd"/>
             <w:r>
               <w:rPr>
                 <w:rFonts w:ascii="Times New Roman" w:hAnsi="Times New Roman" w:cs="Times New Roman"/>
@@ -1508,12 +1438,21 @@
               </w:rPr>
               <w:t xml:space="preserve">Unless </w:t>
             </w:r>
-            <w:r>
-              <w:rPr>
-                <w:rFonts w:ascii="Times New Roman" w:hAnsi="Times New Roman" w:cs="Times New Roman"/>
-                <w:color w:val="auto"/>
-              </w:rPr>
-              <w:t xml:space="preserve">BioSum </w:t>
+            <w:proofErr w:type="spellStart"/>
+            <w:r>
+              <w:rPr>
+                <w:rFonts w:ascii="Times New Roman" w:hAnsi="Times New Roman" w:cs="Times New Roman"/>
+                <w:color w:val="auto"/>
+              </w:rPr>
+              <w:t>BioSum</w:t>
+            </w:r>
+            <w:proofErr w:type="spellEnd"/>
+            <w:r>
+              <w:rPr>
+                <w:rFonts w:ascii="Times New Roman" w:hAnsi="Times New Roman" w:cs="Times New Roman"/>
+                <w:color w:val="auto"/>
+              </w:rPr>
+              <w:t xml:space="preserve"> </w:t>
             </w:r>
             <w:r>
               <w:rPr>
@@ -1550,6 +1489,7 @@
               </w:rPr>
               <w:t xml:space="preserve">, the R software and </w:t>
             </w:r>
+            <w:proofErr w:type="spellStart"/>
             <w:r>
               <w:rPr>
                 <w:rFonts w:ascii="Times New Roman" w:hAnsi="Times New Roman" w:cs="Times New Roman"/>
@@ -1557,6 +1497,7 @@
               </w:rPr>
               <w:t>RSQLite</w:t>
             </w:r>
+            <w:proofErr w:type="spellEnd"/>
             <w:r>
               <w:rPr>
                 <w:rFonts w:ascii="Times New Roman" w:hAnsi="Times New Roman" w:cs="Times New Roman"/>
@@ -1689,6 +1630,7 @@
               </w:rPr>
               <w:t xml:space="preserve">If </w:t>
             </w:r>
+            <w:proofErr w:type="spellStart"/>
             <w:r>
               <w:rPr>
                 <w:rFonts w:ascii="Times New Roman" w:hAnsi="Times New Roman" w:cs="Times New Roman"/>
@@ -1696,6 +1638,7 @@
               </w:rPr>
               <w:t>RSQLite</w:t>
             </w:r>
+            <w:proofErr w:type="spellEnd"/>
             <w:r>
               <w:rPr>
                 <w:rFonts w:ascii="Times New Roman" w:hAnsi="Times New Roman" w:cs="Times New Roman"/>
@@ -1824,6 +1767,13 @@
                 <w:rFonts w:ascii="Times New Roman" w:hAnsi="Times New Roman" w:cs="Times New Roman"/>
                 <w:color w:val="auto"/>
               </w:rPr>
+              <w:t>)</w:t>
+            </w:r>
+            <w:r>
+              <w:rPr>
+                <w:rFonts w:ascii="Times New Roman" w:hAnsi="Times New Roman" w:cs="Times New Roman"/>
+                <w:color w:val="auto"/>
+              </w:rPr>
               <w:t>. It is best to unzip this to the root directory of the C drive (specify C:\ as the location to install</w:t>
             </w:r>
             <w:r>
@@ -1947,7 +1897,6 @@
           <w:sz w:val="28"/>
           <w:szCs w:val="28"/>
         </w:rPr>
-        <w:lastRenderedPageBreak/>
         <w:t xml:space="preserve"> </w:t>
       </w:r>
     </w:p>
@@ -2011,7 +1960,6 @@
         <w:tc>
           <w:tcPr>
             <w:tcW w:w="10278" w:type="dxa"/>
-            <w:shd w:val="clear" w:color="auto" w:fill="auto"/>
           </w:tcPr>
           <w:p>
             <w:pPr>
@@ -2264,7 +2212,23 @@
                 <w:rFonts w:ascii="Times New Roman" w:hAnsi="Times New Roman" w:cs="Times New Roman"/>
                 <w:color w:val="auto"/>
               </w:rPr>
-              <w:t xml:space="preserve"> (e.g., the msi) or command</w:t>
+              <w:t xml:space="preserve"> (e.g., the </w:t>
+            </w:r>
+            <w:proofErr w:type="spellStart"/>
+            <w:r>
+              <w:rPr>
+                <w:rFonts w:ascii="Times New Roman" w:hAnsi="Times New Roman" w:cs="Times New Roman"/>
+                <w:color w:val="auto"/>
+              </w:rPr>
+              <w:t>msi</w:t>
+            </w:r>
+            <w:proofErr w:type="spellEnd"/>
+            <w:r>
+              <w:rPr>
+                <w:rFonts w:ascii="Times New Roman" w:hAnsi="Times New Roman" w:cs="Times New Roman"/>
+                <w:color w:val="auto"/>
+              </w:rPr>
+              <w:t>) or command</w:t>
             </w:r>
             <w:r>
               <w:rPr>
@@ -2502,48 +2466,23 @@
                 <w:rFonts w:ascii="Times New Roman" w:hAnsi="Times New Roman" w:cs="Times New Roman"/>
                 <w:color w:val="auto"/>
               </w:rPr>
-              <w:t xml:space="preserve">unning the BioSum software, once it has been successfully installed, does not require administrative privileges. By default, the BIOSUM software is installed for all user accounts. </w:t>
-            </w:r>
-          </w:p>
-          <w:p>
-            <w:pPr>
-              <w:pStyle w:val="Default"/>
-              <w:ind w:left="540" w:right="706"/>
-              <w:rPr>
-                <w:rFonts w:ascii="Times New Roman" w:hAnsi="Times New Roman" w:cs="Times New Roman"/>
-                <w:color w:val="auto"/>
-              </w:rPr>
-            </w:pPr>
-          </w:p>
-          <w:p>
-            <w:pPr>
-              <w:pStyle w:val="Default"/>
-              <w:ind w:left="540" w:right="706"/>
-              <w:rPr>
-                <w:rFonts w:ascii="Times New Roman" w:hAnsi="Times New Roman" w:cs="Times New Roman"/>
-                <w:color w:val="auto"/>
-              </w:rPr>
-            </w:pPr>
-            <w:r>
-              <w:rPr>
-                <w:rFonts w:ascii="Times New Roman" w:hAnsi="Times New Roman" w:cs="Times New Roman"/>
-                <w:color w:val="auto"/>
-              </w:rPr>
-              <w:t xml:space="preserve">If you intend to open and edit BIOSUM MS Access files, make sure that the directory location </w:t>
-            </w:r>
-            <w:r>
-              <w:rPr>
-                <w:rFonts w:ascii="Times New Roman" w:hAnsi="Times New Roman" w:cs="Times New Roman"/>
-                <w:color w:val="auto"/>
-              </w:rPr>
-              <w:t xml:space="preserve">that houses a BioSum project (which consists of a great many Access database files) </w:t>
-            </w:r>
-            <w:r>
-              <w:rPr>
-                <w:rFonts w:ascii="Times New Roman" w:hAnsi="Times New Roman" w:cs="Times New Roman"/>
-                <w:color w:val="auto"/>
-              </w:rPr>
-              <w:t xml:space="preserve">of the file is set as a trusted location in the Access software settings (under options, trust center settings). </w:t>
+              <w:t xml:space="preserve">unning the </w:t>
+            </w:r>
+            <w:proofErr w:type="spellStart"/>
+            <w:r>
+              <w:rPr>
+                <w:rFonts w:ascii="Times New Roman" w:hAnsi="Times New Roman" w:cs="Times New Roman"/>
+                <w:color w:val="auto"/>
+              </w:rPr>
+              <w:t>BioSum</w:t>
+            </w:r>
+            <w:proofErr w:type="spellEnd"/>
+            <w:r>
+              <w:rPr>
+                <w:rFonts w:ascii="Times New Roman" w:hAnsi="Times New Roman" w:cs="Times New Roman"/>
+                <w:color w:val="auto"/>
+              </w:rPr>
+              <w:t xml:space="preserve"> software, once it has been successfully installed, does not require administrative privileges. By default, the BIOSUM software is installed for all user accounts. </w:t>
             </w:r>
           </w:p>
           <w:p>
@@ -2672,13 +2611,12 @@
           <w:sz w:val="28"/>
         </w:rPr>
       </w:pPr>
-      <w:bookmarkStart w:id="2" w:name="_Hlk53742547"/>
+      <w:bookmarkStart w:id="1" w:name="_Hlk53742547"/>
       <w:r>
         <w:rPr>
           <w:b/>
           <w:sz w:val="28"/>
         </w:rPr>
-        <w:lastRenderedPageBreak/>
         <w:t>Setup Inst</w:t>
       </w:r>
       <w:r>
@@ -2719,7 +2657,7 @@
       <w:r>
         <w:t>Login to your computer as an administrator</w:t>
       </w:r>
-      <w:bookmarkEnd w:id="2"/>
+      <w:bookmarkEnd w:id="1"/>
     </w:p>
     <w:p>
       <w:pPr>
@@ -2954,7 +2892,7 @@
                     </wp:anchor>
                   </w:drawing>
                 </mc:Choice>
-                <mc:Fallback>
+                <mc:Fallback xmlns:w16sdtfl="http://schemas.microsoft.com/office/word/2024/wordml/sdtformatlock" xmlns:w16du="http://schemas.microsoft.com/office/word/2023/wordml/word16du" xmlns:oel="http://schemas.microsoft.com/office/2019/extlst">
                   <w:pict>
                     <v:oval w14:anchorId="6FCAB5B7" id="Oval 86" o:spid="_x0000_s1026" style="position:absolute;margin-left:109.5pt;margin-top:61.4pt;width:44.1pt;height:19.85pt;z-index:251665408;visibility:visible;mso-wrap-style:square;mso-width-percent:0;mso-height-percent:0;mso-wrap-distance-left:9pt;mso-wrap-distance-top:0;mso-wrap-distance-right:9pt;mso-wrap-distance-bottom:0;mso-position-horizontal:absolute;mso-position-horizontal-relative:text;mso-position-vertical:absolute;mso-position-vertical-relative:text;mso-width-percent:0;mso-height-percent:0;mso-width-relative:page;mso-height-relative:page;v-text-anchor:top" o:gfxdata="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" strokecolor="red" strokeweight="2pt">
                       <v:fill opacity="0"/>
@@ -3094,7 +3032,7 @@
                     </wp:anchor>
                   </w:drawing>
                 </mc:Choice>
-                <mc:Fallback>
+                <mc:Fallback xmlns:w16sdtfl="http://schemas.microsoft.com/office/word/2024/wordml/sdtformatlock" xmlns:w16du="http://schemas.microsoft.com/office/word/2023/wordml/word16du" xmlns:oel="http://schemas.microsoft.com/office/2019/extlst">
                   <w:pict>
                     <v:oval w14:anchorId="4BE32222" id="Oval 86" o:spid="_x0000_s1026" style="position:absolute;margin-left:114.05pt;margin-top:124pt;width:44.1pt;height:19.85pt;z-index:251738112;visibility:visible;mso-wrap-style:square;mso-width-percent:0;mso-height-percent:0;mso-wrap-distance-left:9pt;mso-wrap-distance-top:0;mso-wrap-distance-right:9pt;mso-wrap-distance-bottom:0;mso-position-horizontal:absolute;mso-position-horizontal-relative:text;mso-position-vertical:absolute;mso-position-vertical-relative:text;mso-width-percent:0;mso-height-percent:0;mso-width-relative:page;mso-height-relative:page;v-text-anchor:top" o:gfxdata="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" strokecolor="red" strokeweight="2pt">
                       <v:fill opacity="0"/>
@@ -3316,7 +3254,7 @@
                     </wp:anchor>
                   </w:drawing>
                 </mc:Choice>
-                <mc:Fallback>
+                <mc:Fallback xmlns:w16sdtfl="http://schemas.microsoft.com/office/word/2024/wordml/sdtformatlock" xmlns:w16du="http://schemas.microsoft.com/office/word/2023/wordml/word16du" xmlns:oel="http://schemas.microsoft.com/office/2019/extlst">
                   <w:pict>
                     <v:oval w14:anchorId="3F77E0E2" id="Oval 86" o:spid="_x0000_s1026" style="position:absolute;margin-left:131.8pt;margin-top:140.5pt;width:44.1pt;height:19.85pt;z-index:251740160;visibility:visible;mso-wrap-style:square;mso-width-percent:0;mso-height-percent:0;mso-wrap-distance-left:9pt;mso-wrap-distance-top:0;mso-wrap-distance-right:9pt;mso-wrap-distance-bottom:0;mso-position-horizontal:absolute;mso-position-horizontal-relative:text;mso-position-vertical:absolute;mso-position-vertical-relative:text;mso-width-percent:0;mso-height-percent:0;mso-width-relative:page;mso-height-relative:page;v-text-anchor:top" o:gfxdata="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" strokecolor="red" strokeweight="2pt">
                       <v:fill opacity="0"/>
@@ -3456,7 +3394,7 @@
                     </wp:anchor>
                   </w:drawing>
                 </mc:Choice>
-                <mc:Fallback>
+                <mc:Fallback xmlns:w16sdtfl="http://schemas.microsoft.com/office/word/2024/wordml/sdtformatlock" xmlns:w16du="http://schemas.microsoft.com/office/word/2023/wordml/word16du" xmlns:oel="http://schemas.microsoft.com/office/2019/extlst">
                   <w:pict>
                     <v:oval w14:anchorId="24DA1C3E" id="Oval 86" o:spid="_x0000_s1026" style="position:absolute;margin-left:146.85pt;margin-top:156.1pt;width:44.1pt;height:19.85pt;z-index:251744256;visibility:visible;mso-wrap-style:square;mso-width-percent:0;mso-height-percent:0;mso-wrap-distance-left:9pt;mso-wrap-distance-top:0;mso-wrap-distance-right:9pt;mso-wrap-distance-bottom:0;mso-position-horizontal:absolute;mso-position-horizontal-relative:text;mso-position-vertical:absolute;mso-position-vertical-relative:text;mso-width-percent:0;mso-height-percent:0;mso-width-relative:page;mso-height-relative:page;v-text-anchor:top" o:gfxdata="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" strokecolor="red" strokeweight="2pt">
                       <v:fill opacity="0"/>
@@ -3530,7 +3468,7 @@
                     </wp:anchor>
                   </w:drawing>
                 </mc:Choice>
-                <mc:Fallback>
+                <mc:Fallback xmlns:w16sdtfl="http://schemas.microsoft.com/office/word/2024/wordml/sdtformatlock" xmlns:w16du="http://schemas.microsoft.com/office/word/2023/wordml/word16du" xmlns:oel="http://schemas.microsoft.com/office/2019/extlst">
                   <w:pict>
                     <v:oval w14:anchorId="4B5506C1" id="Oval 86" o:spid="_x0000_s1026" style="position:absolute;margin-left:10.65pt;margin-top:71.5pt;width:44.1pt;height:19.85pt;z-index:251742208;visibility:visible;mso-wrap-style:square;mso-width-percent:0;mso-height-percent:0;mso-wrap-distance-left:9pt;mso-wrap-distance-top:0;mso-wrap-distance-right:9pt;mso-wrap-distance-bottom:0;mso-position-horizontal:absolute;mso-position-horizontal-relative:text;mso-position-vertical:absolute;mso-position-vertical-relative:text;mso-width-percent:0;mso-height-percent:0;mso-width-relative:page;mso-height-relative:page;v-text-anchor:top" o:gfxdata="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" strokecolor="red" strokeweight="2pt">
                       <v:fill opacity="0"/>
@@ -3637,7 +3575,6 @@
               <w:rPr>
                 <w:noProof/>
               </w:rPr>
-              <w:lastRenderedPageBreak/>
               <w:t>Accept the defaults and click &lt;Next&gt;.</w:t>
             </w:r>
             <w:r>
@@ -3750,7 +3687,7 @@
                     </wp:anchor>
                   </w:drawing>
                 </mc:Choice>
-                <mc:Fallback>
+                <mc:Fallback xmlns:w16sdtfl="http://schemas.microsoft.com/office/word/2024/wordml/sdtformatlock" xmlns:w16du="http://schemas.microsoft.com/office/word/2023/wordml/word16du" xmlns:oel="http://schemas.microsoft.com/office/2019/extlst">
                   <w:pict>
                     <v:oval w14:anchorId="2005AF62" id="Oval 86" o:spid="_x0000_s1026" style="position:absolute;margin-left:135.9pt;margin-top:141.45pt;width:51pt;height:17.4pt;z-index:251746304;visibility:visible;mso-wrap-style:square;mso-width-percent:0;mso-height-percent:0;mso-wrap-distance-left:9pt;mso-wrap-distance-top:0;mso-wrap-distance-right:9pt;mso-wrap-distance-bottom:0;mso-position-horizontal:absolute;mso-position-horizontal-relative:text;mso-position-vertical:absolute;mso-position-vertical-relative:text;mso-width-percent:0;mso-height-percent:0;mso-width-relative:page;mso-height-relative:page;v-text-anchor:top" o:gfxdata="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" strokecolor="red" strokeweight="2pt">
                       <v:fill opacity="0"/>
@@ -3890,7 +3827,7 @@
                     </wp:anchor>
                   </w:drawing>
                 </mc:Choice>
-                <mc:Fallback>
+                <mc:Fallback xmlns:w16sdtfl="http://schemas.microsoft.com/office/word/2024/wordml/sdtformatlock" xmlns:w16du="http://schemas.microsoft.com/office/word/2023/wordml/word16du" xmlns:oel="http://schemas.microsoft.com/office/2019/extlst">
                   <w:pict>
                     <v:oval w14:anchorId="6432BE1A" id="Oval 86" o:spid="_x0000_s1026" style="position:absolute;margin-left:140.25pt;margin-top:145.9pt;width:51pt;height:17.4pt;z-index:251750400;visibility:visible;mso-wrap-style:square;mso-width-percent:0;mso-height-percent:0;mso-wrap-distance-left:9pt;mso-wrap-distance-top:0;mso-wrap-distance-right:9pt;mso-wrap-distance-bottom:0;mso-position-horizontal:absolute;mso-position-horizontal-relative:text;mso-position-vertical:absolute;mso-position-vertical-relative:text;mso-width-percent:0;mso-height-percent:0;mso-width-relative:page;mso-height-relative:page;v-text-anchor:top" o:gfxdata="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" strokecolor="red" strokeweight="2pt">
                       <v:fill opacity="0"/>
@@ -3964,7 +3901,7 @@
                     </wp:anchor>
                   </w:drawing>
                 </mc:Choice>
-                <mc:Fallback>
+                <mc:Fallback xmlns:w16sdtfl="http://schemas.microsoft.com/office/word/2024/wordml/sdtformatlock" xmlns:w16du="http://schemas.microsoft.com/office/word/2023/wordml/word16du" xmlns:oel="http://schemas.microsoft.com/office/2019/extlst">
                   <w:pict>
                     <v:oval w14:anchorId="553CC9CA" id="Oval 86" o:spid="_x0000_s1026" style="position:absolute;margin-left:29.55pt;margin-top:59.5pt;width:51pt;height:17.4pt;z-index:251748352;visibility:visible;mso-wrap-style:square;mso-width-percent:0;mso-height-percent:0;mso-wrap-distance-left:9pt;mso-wrap-distance-top:0;mso-wrap-distance-right:9pt;mso-wrap-distance-bottom:0;mso-position-horizontal:absolute;mso-position-horizontal-relative:text;mso-position-vertical:absolute;mso-position-vertical-relative:text;mso-width-percent:0;mso-height-percent:0;mso-width-relative:page;mso-height-relative:page;v-text-anchor:top" o:gfxdata="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" strokecolor="red" strokeweight="2pt">
                       <v:fill opacity="0"/>
@@ -4156,7 +4093,7 @@
                     </wp:anchor>
                   </w:drawing>
                 </mc:Choice>
-                <mc:Fallback>
+                <mc:Fallback xmlns:w16sdtfl="http://schemas.microsoft.com/office/word/2024/wordml/sdtformatlock" xmlns:w16du="http://schemas.microsoft.com/office/word/2023/wordml/word16du" xmlns:oel="http://schemas.microsoft.com/office/2019/extlst">
                   <w:pict>
                     <v:oval w14:anchorId="2EE2366C" id="Oval 86" o:spid="_x0000_s1026" style="position:absolute;margin-left:141.65pt;margin-top:151.55pt;width:51pt;height:22.8pt;z-index:251754496;visibility:visible;mso-wrap-style:square;mso-width-percent:0;mso-height-percent:0;mso-wrap-distance-left:9pt;mso-wrap-distance-top:0;mso-wrap-distance-right:9pt;mso-wrap-distance-bottom:0;mso-position-horizontal:absolute;mso-position-horizontal-relative:text;mso-position-vertical:absolute;mso-position-vertical-relative:text;mso-width-percent:0;mso-height-percent:0;mso-width-relative:page;mso-height-relative:page;v-text-anchor:top" o:gfxdata="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" strokecolor="red" strokeweight="2pt">
                       <v:fill opacity="0"/>
@@ -4296,7 +4233,7 @@
                     </wp:anchor>
                   </w:drawing>
                 </mc:Choice>
-                <mc:Fallback>
+                <mc:Fallback xmlns:w16sdtfl="http://schemas.microsoft.com/office/word/2024/wordml/sdtformatlock" xmlns:w16du="http://schemas.microsoft.com/office/word/2023/wordml/word16du" xmlns:oel="http://schemas.microsoft.com/office/2019/extlst">
                   <w:pict>
                     <v:oval w14:anchorId="728F7E86" id="Oval 86" o:spid="_x0000_s1026" style="position:absolute;margin-left:131.15pt;margin-top:145.05pt;width:51pt;height:22.8pt;z-index:251756544;visibility:visible;mso-wrap-style:square;mso-width-percent:0;mso-height-percent:0;mso-wrap-distance-left:9pt;mso-wrap-distance-top:0;mso-wrap-distance-right:9pt;mso-wrap-distance-bottom:0;mso-position-horizontal:absolute;mso-position-horizontal-relative:text;mso-position-vertical:absolute;mso-position-vertical-relative:text;mso-width-percent:0;mso-height-percent:0;mso-width-relative:page;mso-height-relative:page;v-text-anchor:top" o:gfxdata="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" strokecolor="red" strokeweight="2pt">
                       <v:fill opacity="0"/>
@@ -4485,7 +4422,7 @@
                     </wp:anchor>
                   </w:drawing>
                 </mc:Choice>
-                <mc:Fallback>
+                <mc:Fallback xmlns:w16sdtfl="http://schemas.microsoft.com/office/word/2024/wordml/sdtformatlock" xmlns:w16du="http://schemas.microsoft.com/office/word/2023/wordml/word16du" xmlns:oel="http://schemas.microsoft.com/office/2019/extlst">
                   <w:pict>
                     <v:oval w14:anchorId="66D2539E" id="Oval 86" o:spid="_x0000_s1026" style="position:absolute;margin-left:261.15pt;margin-top:172.95pt;width:51pt;height:22.8pt;z-index:251752448;visibility:visible;mso-wrap-style:square;mso-width-percent:0;mso-height-percent:0;mso-wrap-distance-left:9pt;mso-wrap-distance-top:0;mso-wrap-distance-right:9pt;mso-wrap-distance-bottom:0;mso-position-horizontal:absolute;mso-position-horizontal-relative:text;mso-position-vertical:absolute;mso-position-vertical-relative:text;mso-width-percent:0;mso-height-percent:0;mso-width-relative:page;mso-height-relative:page;v-text-anchor:top" o:gfxdata="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" strokecolor="red" strokeweight="2pt">
                       <v:fill opacity="0"/>
@@ -4571,15 +4508,16 @@
         <w:rPr>
           <w:b/>
         </w:rPr>
-        <w:lastRenderedPageBreak/>
         <w:t xml:space="preserve">Install </w:t>
       </w:r>
+      <w:proofErr w:type="spellStart"/>
       <w:r>
         <w:rPr>
           <w:b/>
         </w:rPr>
         <w:t>RSQLite</w:t>
       </w:r>
+      <w:proofErr w:type="spellEnd"/>
       <w:r>
         <w:rPr>
           <w:b/>
@@ -4589,12 +4527,14 @@
       <w:r>
         <w:t xml:space="preserve">If </w:t>
       </w:r>
+      <w:proofErr w:type="spellStart"/>
       <w:r>
         <w:rPr>
           <w:b/>
         </w:rPr>
         <w:t>RSQLite</w:t>
       </w:r>
+      <w:proofErr w:type="spellEnd"/>
       <w:r>
         <w:t xml:space="preserve"> </w:t>
       </w:r>
@@ -4616,8 +4556,13 @@
       <w:r>
         <w:t xml:space="preserve">  </w:t>
       </w:r>
-      <w:r>
-        <w:t xml:space="preserve">RSQLite </w:t>
+      <w:proofErr w:type="spellStart"/>
+      <w:r>
+        <w:t>RSQLite</w:t>
+      </w:r>
+      <w:proofErr w:type="spellEnd"/>
+      <w:r>
+        <w:t xml:space="preserve"> </w:t>
       </w:r>
       <w:r>
         <w:t xml:space="preserve">enables R to connect to </w:t>
@@ -4649,8 +4594,13 @@
       <w:r>
         <w:t xml:space="preserve"> NOTE: An internet connection is required for the </w:t>
       </w:r>
-      <w:r>
-        <w:t xml:space="preserve">RSQLite </w:t>
+      <w:proofErr w:type="spellStart"/>
+      <w:r>
+        <w:t>RSQLite</w:t>
+      </w:r>
+      <w:proofErr w:type="spellEnd"/>
+      <w:r>
+        <w:t xml:space="preserve"> </w:t>
       </w:r>
       <w:r>
         <w:t>install.</w:t>
@@ -4744,7 +4694,7 @@
               </wp:anchor>
             </w:drawing>
           </mc:Choice>
-          <mc:Fallback>
+          <mc:Fallback xmlns:w16sdtfl="http://schemas.microsoft.com/office/word/2024/wordml/sdtformatlock" xmlns:w16du="http://schemas.microsoft.com/office/word/2023/wordml/word16du" xmlns:oel="http://schemas.microsoft.com/office/2019/extlst">
             <w:pict>
               <v:oval w14:anchorId="5F078E13" id="Oval 86" o:spid="_x0000_s1026" style="position:absolute;margin-left:220.15pt;margin-top:136pt;width:76.5pt;height:27.05pt;z-index:251674624;visibility:visible;mso-wrap-style:square;mso-width-percent:0;mso-height-percent:0;mso-wrap-distance-left:9pt;mso-wrap-distance-top:0;mso-wrap-distance-right:9pt;mso-wrap-distance-bottom:0;mso-position-horizontal:absolute;mso-position-horizontal-relative:text;mso-position-vertical:absolute;mso-position-vertical-relative:text;mso-width-percent:0;mso-height-percent:0;mso-width-relative:page;mso-height-relative:page;v-text-anchor:top" o:gfxdata="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" strokecolor="red" strokeweight="2pt">
                 <v:fill opacity="0"/>
@@ -4834,15 +4784,7 @@
         <w:t xml:space="preserve"> Click on &lt;Packages&gt;</w:t>
       </w:r>
       <w:r>
-        <w:t xml:space="preserve"> &lt;Set CRAN mirror</w:t>
-      </w:r>
-      <w:proofErr w:type="gramStart"/>
-      <w:r>
-        <w:t>&gt;, and</w:t>
-      </w:r>
-      <w:proofErr w:type="gramEnd"/>
-      <w:r>
-        <w:t xml:space="preserve"> choose a mirror location near you. </w:t>
+        <w:t xml:space="preserve"> &lt;Set CRAN mirror&gt;, and choose a mirror location near you. </w:t>
       </w:r>
       <w:r>
         <w:br/>
@@ -4945,7 +4887,7 @@
                     </wp:anchor>
                   </w:drawing>
                 </mc:Choice>
-                <mc:Fallback>
+                <mc:Fallback xmlns:w16sdtfl="http://schemas.microsoft.com/office/word/2024/wordml/sdtformatlock" xmlns:w16du="http://schemas.microsoft.com/office/word/2023/wordml/word16du" xmlns:oel="http://schemas.microsoft.com/office/2019/extlst">
                   <w:pict>
                     <v:oval w14:anchorId="3A286733" id="Oval 86" o:spid="_x0000_s1026" style="position:absolute;margin-left:116.65pt;margin-top:47.25pt;width:50.95pt;height:15.15pt;z-index:251684864;visibility:visible;mso-wrap-style:square;mso-width-percent:0;mso-height-percent:0;mso-wrap-distance-left:9pt;mso-wrap-distance-top:0;mso-wrap-distance-right:9pt;mso-wrap-distance-bottom:0;mso-position-horizontal:absolute;mso-position-horizontal-relative:text;mso-position-vertical:absolute;mso-position-vertical-relative:text;mso-width-percent:0;mso-height-percent:0;mso-width-relative:page;mso-height-relative:page;v-text-anchor:top" o:gfxdata="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" strokecolor="red" strokeweight="2pt">
                       <v:fill opacity="0"/>
@@ -5085,7 +5027,7 @@
                     </wp:anchor>
                   </w:drawing>
                 </mc:Choice>
-                <mc:Fallback>
+                <mc:Fallback xmlns:w16sdtfl="http://schemas.microsoft.com/office/word/2024/wordml/sdtformatlock" xmlns:w16du="http://schemas.microsoft.com/office/word/2023/wordml/word16du" xmlns:oel="http://schemas.microsoft.com/office/2019/extlst">
                   <w:pict>
                     <v:oval w14:anchorId="6C41A2AA" id="Oval 86" o:spid="_x0000_s1026" style="position:absolute;margin-left:39.25pt;margin-top:144.75pt;width:50.95pt;height:15.15pt;z-index:251686912;visibility:visible;mso-wrap-style:square;mso-width-percent:0;mso-height-percent:0;mso-wrap-distance-left:9pt;mso-wrap-distance-top:0;mso-wrap-distance-right:9pt;mso-wrap-distance-bottom:0;mso-position-horizontal:absolute;mso-position-horizontal-relative:text;mso-position-vertical:absolute;mso-position-vertical-relative:text;mso-width-percent:0;mso-height-percent:0;mso-width-relative:page;mso-height-relative:page;v-text-anchor:top" o:gfxdata="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" strokecolor="red" strokeweight="2pt">
                       <v:fill opacity="0"/>
@@ -5159,7 +5101,7 @@
                     </wp:anchor>
                   </w:drawing>
                 </mc:Choice>
-                <mc:Fallback>
+                <mc:Fallback xmlns:w16sdtfl="http://schemas.microsoft.com/office/word/2024/wordml/sdtformatlock" xmlns:w16du="http://schemas.microsoft.com/office/word/2023/wordml/word16du" xmlns:oel="http://schemas.microsoft.com/office/2019/extlst">
                   <w:pict>
                     <v:oval w14:anchorId="497B92E1" id="Oval 86" o:spid="_x0000_s1026" style="position:absolute;margin-left:-4.25pt;margin-top:64.5pt;width:50.95pt;height:15.15pt;z-index:251685888;visibility:visible;mso-wrap-style:square;mso-width-percent:0;mso-height-percent:0;mso-wrap-distance-left:9pt;mso-wrap-distance-top:0;mso-wrap-distance-right:9pt;mso-wrap-distance-bottom:0;mso-position-horizontal:absolute;mso-position-horizontal-relative:text;mso-position-vertical:absolute;mso-position-vertical-relative:text;mso-width-percent:0;mso-height-percent:0;mso-width-relative:page;mso-height-relative:page;v-text-anchor:top" o:gfxdata="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" strokecolor="red" strokeweight="2pt">
                       <v:fill opacity="0"/>
@@ -5237,7 +5179,6 @@
         <w:ind w:right="720"/>
       </w:pPr>
       <w:r>
-        <w:lastRenderedPageBreak/>
         <w:t xml:space="preserve"> </w:t>
       </w:r>
       <w:r>
@@ -5317,7 +5258,7 @@
               </wp:anchor>
             </w:drawing>
           </mc:Choice>
-          <mc:Fallback>
+          <mc:Fallback xmlns:w16sdtfl="http://schemas.microsoft.com/office/word/2024/wordml/sdtformatlock" xmlns:w16du="http://schemas.microsoft.com/office/word/2023/wordml/word16du" xmlns:oel="http://schemas.microsoft.com/office/2019/extlst">
             <w:pict>
               <v:oval w14:anchorId="6E78B109" id="Oval 86" o:spid="_x0000_s1026" style="position:absolute;margin-left:149.65pt;margin-top:15.15pt;width:50.95pt;height:15.15pt;z-index:251675648;visibility:visible;mso-wrap-style:square;mso-width-percent:0;mso-height-percent:0;mso-wrap-distance-left:9pt;mso-wrap-distance-top:0;mso-wrap-distance-right:9pt;mso-wrap-distance-bottom:0;mso-position-horizontal:absolute;mso-position-horizontal-relative:text;mso-position-vertical:absolute;mso-position-vertical-relative:text;mso-width-percent:0;mso-height-percent:0;mso-width-relative:page;mso-height-relative:page;v-text-anchor:top" o:gfxdata="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" strokecolor="red" strokeweight="2pt">
                 <v:fill opacity="0"/>
@@ -5391,7 +5332,7 @@
               </wp:anchor>
             </w:drawing>
           </mc:Choice>
-          <mc:Fallback>
+          <mc:Fallback xmlns:w16sdtfl="http://schemas.microsoft.com/office/word/2024/wordml/sdtformatlock" xmlns:w16du="http://schemas.microsoft.com/office/word/2023/wordml/word16du" xmlns:oel="http://schemas.microsoft.com/office/2019/extlst">
             <w:pict>
               <v:oval w14:anchorId="30B7BFA6" id="Oval 86" o:spid="_x0000_s1026" style="position:absolute;margin-left:179.2pt;margin-top:86pt;width:59.2pt;height:15.15pt;z-index:251683840;visibility:visible;mso-wrap-style:square;mso-width-percent:0;mso-height-percent:0;mso-wrap-distance-left:9pt;mso-wrap-distance-top:0;mso-wrap-distance-right:9pt;mso-wrap-distance-bottom:0;mso-position-horizontal:absolute;mso-position-horizontal-relative:text;mso-position-vertical:absolute;mso-position-vertical-relative:text;mso-width-percent:0;mso-height-percent:0;mso-width-relative:page;mso-height-relative:page;v-text-anchor:top" o:gfxdata="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" strokecolor="red" strokeweight="2pt">
                 <v:fill opacity="0"/>
@@ -5486,9 +5427,11 @@
       <w:r>
         <w:t>Select the &lt;</w:t>
       </w:r>
+      <w:proofErr w:type="spellStart"/>
       <w:r>
         <w:t>RSQLite</w:t>
       </w:r>
+      <w:proofErr w:type="spellEnd"/>
       <w:r>
         <w:t>&gt; package to download and install. Click &lt;OK&gt;.</w:t>
       </w:r>
@@ -5565,7 +5508,7 @@
               </wp:anchor>
             </w:drawing>
           </mc:Choice>
-          <mc:Fallback>
+          <mc:Fallback xmlns:w16sdtfl="http://schemas.microsoft.com/office/word/2024/wordml/sdtformatlock" xmlns:w16du="http://schemas.microsoft.com/office/word/2023/wordml/word16du" xmlns:oel="http://schemas.microsoft.com/office/2019/extlst">
             <w:pict>
               <v:oval w14:anchorId="5F4BCEF0" id="Oval 86" o:spid="_x0000_s1026" style="position:absolute;margin-left:48.25pt;margin-top:120.45pt;width:59.2pt;height:15.15pt;z-index:251677696;visibility:visible;mso-wrap-style:square;mso-width-percent:0;mso-height-percent:0;mso-wrap-distance-left:9pt;mso-wrap-distance-top:0;mso-wrap-distance-right:9pt;mso-wrap-distance-bottom:0;mso-position-horizontal:absolute;mso-position-horizontal-relative:text;mso-position-vertical:absolute;mso-position-vertical-relative:text;mso-width-percent:0;mso-height-percent:0;mso-width-relative:page;mso-height-relative:page;v-text-anchor:top" o:gfxdata="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" strokecolor="red" strokeweight="2pt">
                 <v:fill opacity="0"/>
@@ -5694,7 +5637,7 @@
               </wp:anchor>
             </w:drawing>
           </mc:Choice>
-          <mc:Fallback>
+          <mc:Fallback xmlns:w16sdtfl="http://schemas.microsoft.com/office/word/2024/wordml/sdtformatlock" xmlns:w16du="http://schemas.microsoft.com/office/word/2023/wordml/word16du" xmlns:oel="http://schemas.microsoft.com/office/2019/extlst">
             <w:pict>
               <v:oval w14:anchorId="2BB5524F" id="Oval 86" o:spid="_x0000_s1026" style="position:absolute;margin-left:247.6pt;margin-top:372.8pt;width:59.2pt;height:15.15pt;z-index:251680768;visibility:visible;mso-wrap-style:square;mso-width-percent:0;mso-height-percent:0;mso-wrap-distance-left:9pt;mso-wrap-distance-top:0;mso-wrap-distance-right:9pt;mso-wrap-distance-bottom:0;mso-position-horizontal:absolute;mso-position-horizontal-relative:text;mso-position-vertical:absolute;mso-position-vertical-relative:text;mso-width-percent:0;mso-height-percent:0;mso-width-relative:page;mso-height-relative:page;v-text-anchor:top" o:gfxdata="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" strokecolor="red" strokeweight="2pt">
                 <v:fill opacity="0"/>
@@ -5809,7 +5752,7 @@
               </wp:anchor>
             </w:drawing>
           </mc:Choice>
-          <mc:Fallback>
+          <mc:Fallback xmlns:w16sdtfl="http://schemas.microsoft.com/office/word/2024/wordml/sdtformatlock" xmlns:w16du="http://schemas.microsoft.com/office/word/2023/wordml/word16du" xmlns:oel="http://schemas.microsoft.com/office/2019/extlst">
             <w:pict>
               <v:oval w14:anchorId="4C013D82" id="Oval 86" o:spid="_x0000_s1026" style="position:absolute;margin-left:73.8pt;margin-top:194.65pt;width:278.35pt;height:29.75pt;z-index:251681792;visibility:visible;mso-wrap-style:square;mso-width-percent:0;mso-height-percent:0;mso-wrap-distance-left:9pt;mso-wrap-distance-top:0;mso-wrap-distance-right:9pt;mso-wrap-distance-bottom:0;mso-position-horizontal:absolute;mso-position-horizontal-relative:text;mso-position-vertical:absolute;mso-position-vertical-relative:text;mso-width-percent:0;mso-height-percent:0;mso-width-relative:page;mso-height-relative:page;v-text-anchor:top" o:gfxdata="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" strokecolor="red" strokeweight="2pt">
                 <v:fill opacity="0"/>
@@ -5833,7 +5776,6 @@
         <w:rPr>
           <w:noProof/>
         </w:rPr>
-        <w:lastRenderedPageBreak/>
         <mc:AlternateContent>
           <mc:Choice Requires="wps">
             <w:drawing>
@@ -5895,7 +5837,7 @@
               </wp:anchor>
             </w:drawing>
           </mc:Choice>
-          <mc:Fallback>
+          <mc:Fallback xmlns:w16sdtfl="http://schemas.microsoft.com/office/word/2024/wordml/sdtformatlock" xmlns:w16du="http://schemas.microsoft.com/office/word/2023/wordml/word16du" xmlns:oel="http://schemas.microsoft.com/office/2019/extlst">
             <w:pict>
               <v:oval w14:anchorId="245559E6" id="Oval 86" o:spid="_x0000_s1026" style="position:absolute;margin-left:63.7pt;margin-top:209.2pt;width:302.15pt;height:24.15pt;z-index:251678720;visibility:visible;mso-wrap-style:square;mso-width-percent:0;mso-height-percent:0;mso-wrap-distance-left:9pt;mso-wrap-distance-top:0;mso-wrap-distance-right:9pt;mso-wrap-distance-bottom:0;mso-position-horizontal:absolute;mso-position-horizontal-relative:text;mso-position-vertical:absolute;mso-position-vertical-relative:text;mso-width-percent:0;mso-height-percent:0;mso-width-relative:page;mso-height-relative:page;v-text-anchor:top" o:gfxdata="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" strokecolor="red" strokeweight="2pt">
                 <v:fill opacity="0"/>
@@ -5993,10 +5935,34 @@
                 <w:b/>
                 <w:bCs/>
               </w:rPr>
-              <w:t>Install FIA Biosum Manager:</w:t>
-            </w:r>
-            <w:r>
-              <w:t xml:space="preserve"> Navigate to the c:\ fia_biosum\setup folder. Open the file ‘fia_biosum_setup_versionnumber.msi via right click, </w:t>
+              <w:t xml:space="preserve">Install FIA </w:t>
+            </w:r>
+            <w:proofErr w:type="spellStart"/>
+            <w:r>
+              <w:rPr>
+                <w:b/>
+                <w:bCs/>
+              </w:rPr>
+              <w:t>Biosum</w:t>
+            </w:r>
+            <w:proofErr w:type="spellEnd"/>
+            <w:r>
+              <w:rPr>
+                <w:b/>
+                <w:bCs/>
+              </w:rPr>
+              <w:t xml:space="preserve"> Manager:</w:t>
+            </w:r>
+            <w:r>
+              <w:t xml:space="preserve"> Navigate to the c:\ </w:t>
+            </w:r>
+            <w:proofErr w:type="spellStart"/>
+            <w:r>
+              <w:t>fia_biosum</w:t>
+            </w:r>
+            <w:proofErr w:type="spellEnd"/>
+            <w:r>
+              <w:t xml:space="preserve">\setup folder. Open the file ‘fia_biosum_setup_versionnumber.msi via right click, </w:t>
             </w:r>
             <w:proofErr w:type="gramStart"/>
             <w:r>
@@ -6115,7 +6081,7 @@
               </wp:anchor>
             </w:drawing>
           </mc:Choice>
-          <mc:Fallback>
+          <mc:Fallback xmlns:w16sdtfl="http://schemas.microsoft.com/office/word/2024/wordml/sdtformatlock" xmlns:w16du="http://schemas.microsoft.com/office/word/2023/wordml/word16du" xmlns:oel="http://schemas.microsoft.com/office/2019/extlst">
             <w:pict>
               <v:oval w14:anchorId="3C6F9E22" id="Oval 86" o:spid="_x0000_s1026" style="position:absolute;margin-left:299.25pt;margin-top:127.35pt;width:39.6pt;height:19.85pt;z-index:251778048;visibility:visible;mso-wrap-style:square;mso-width-percent:0;mso-height-percent:0;mso-wrap-distance-left:9pt;mso-wrap-distance-top:0;mso-wrap-distance-right:9pt;mso-wrap-distance-bottom:0;mso-position-horizontal:absolute;mso-position-horizontal-relative:text;mso-position-vertical:absolute;mso-position-vertical-relative:text;mso-width-percent:0;mso-height-percent:0;mso-width-relative:page;mso-height-relative:page;v-text-anchor:top" o:gfxdata="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" strokecolor="red" strokeweight="2pt">
                 <v:fill opacity="0"/>
@@ -6189,7 +6155,7 @@
               </wp:anchor>
             </w:drawing>
           </mc:Choice>
-          <mc:Fallback>
+          <mc:Fallback xmlns:w16sdtfl="http://schemas.microsoft.com/office/word/2024/wordml/sdtformatlock" xmlns:w16du="http://schemas.microsoft.com/office/word/2023/wordml/word16du" xmlns:oel="http://schemas.microsoft.com/office/2019/extlst">
             <w:pict>
               <v:oval w14:anchorId="54962BB2" id="Oval 86" o:spid="_x0000_s1026" style="position:absolute;margin-left:128.2pt;margin-top:127.55pt;width:39.6pt;height:19.85pt;z-index:251777024;visibility:visible;mso-wrap-style:square;mso-width-percent:0;mso-height-percent:0;mso-wrap-distance-left:9pt;mso-wrap-distance-top:0;mso-wrap-distance-right:9pt;mso-wrap-distance-bottom:0;mso-position-horizontal:absolute;mso-position-horizontal-relative:text;mso-position-vertical:absolute;mso-position-vertical-relative:text;mso-width-percent:0;mso-height-percent:0;mso-width-relative:page;mso-height-relative:page;v-text-anchor:top" o:gfxdata="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" strokecolor="red" strokeweight="2pt">
                 <v:fill opacity="0"/>
@@ -6357,79 +6323,11 @@
     </w:tbl>
     <w:p>
       <w:pPr>
-        <w:ind w:left="990" w:right="720" w:firstLine="720"/>
-      </w:pPr>
-    </w:p>
-    <w:p>
-      <w:pPr>
         <w:pStyle w:val="ListParagraph"/>
-        <w:numPr>
-          <w:ilvl w:val="0"/>
-          <w:numId w:val="11"/>
-        </w:numPr>
         <w:spacing w:after="120"/>
+        <w:ind w:left="1440"/>
         <w:contextualSpacing w:val="0"/>
       </w:pPr>
-      <w:r>
-        <w:t xml:space="preserve">If running Access 2016, Office 365 or any other version later than 2013, you will need to install the </w:t>
-      </w:r>
-      <w:r>
-        <w:rPr>
-          <w:b/>
-          <w:bCs/>
-        </w:rPr>
-        <w:t>Microsoft Access Database Engine 2016 64-bit Redistributable</w:t>
-      </w:r>
-      <w:r>
-        <w:t>.</w:t>
-      </w:r>
-      <w:r>
-        <w:t xml:space="preserve"> </w:t>
-      </w:r>
-      <w:r>
-        <w:t xml:space="preserve">This can be </w:t>
-      </w:r>
-      <w:r>
-        <w:t>download</w:t>
-      </w:r>
-      <w:r>
-        <w:t>ed</w:t>
-      </w:r>
-      <w:r>
-        <w:t xml:space="preserve"> via </w:t>
-      </w:r>
-      <w:proofErr w:type="gramStart"/>
-      <w:r>
-        <w:t>https://www.microsoft.com/en-us/download/details.aspx?id=54920</w:t>
-      </w:r>
-      <w:r>
-        <w:t xml:space="preserve">, </w:t>
-      </w:r>
-      <w:r>
-        <w:t>and</w:t>
-      </w:r>
-      <w:proofErr w:type="gramEnd"/>
-      <w:r>
-        <w:t xml:space="preserve"> must be installed with admin privileges</w:t>
-      </w:r>
-      <w:r>
-        <w:t>.</w:t>
-      </w:r>
-      <w:r>
-        <w:t xml:space="preserve"> Forest service users </w:t>
-      </w:r>
-      <w:r>
-        <w:t>may</w:t>
-      </w:r>
-      <w:r>
-        <w:t xml:space="preserve"> find this component in the Software Center</w:t>
-      </w:r>
-      <w:r>
-        <w:t>, but if not, will need to have the Customer Help Desk perform this install remotely, as admin</w:t>
-      </w:r>
-      <w:r>
-        <w:t>.</w:t>
-      </w:r>
     </w:p>
     <w:tbl>
       <w:tblPr>
@@ -6460,7 +6358,15 @@
               <w:t>S</w:t>
             </w:r>
             <w:r>
-              <w:t>tart BioSum Manager and select the Settings menu</w:t>
+              <w:t xml:space="preserve">tart </w:t>
+            </w:r>
+            <w:proofErr w:type="spellStart"/>
+            <w:r>
+              <w:t>BioSum</w:t>
+            </w:r>
+            <w:proofErr w:type="spellEnd"/>
+            <w:r>
+              <w:t xml:space="preserve"> Manager and select the Settings menu</w:t>
             </w:r>
           </w:p>
         </w:tc>
@@ -6542,7 +6448,7 @@
                     </wp:anchor>
                   </w:drawing>
                 </mc:Choice>
-                <mc:Fallback>
+                <mc:Fallback xmlns:w16sdtfl="http://schemas.microsoft.com/office/word/2024/wordml/sdtformatlock" xmlns:w16du="http://schemas.microsoft.com/office/word/2023/wordml/word16du" xmlns:oel="http://schemas.microsoft.com/office/2019/extlst">
                   <w:pict>
                     <v:oval w14:anchorId="7B565D05" id="Oval 86" o:spid="_x0000_s1026" style="position:absolute;margin-left:38.15pt;margin-top:9.2pt;width:69pt;height:27.05pt;z-index:251760640;visibility:visible;mso-wrap-style:square;mso-width-percent:0;mso-height-percent:0;mso-wrap-distance-left:9pt;mso-wrap-distance-top:0;mso-wrap-distance-right:9pt;mso-wrap-distance-bottom:0;mso-position-horizontal:absolute;mso-position-horizontal-relative:text;mso-position-vertical:absolute;mso-position-vertical-relative:text;mso-width-percent:0;mso-height-percent:0;mso-width-relative:page;mso-height-relative:page;v-text-anchor:top" o:gfxdata="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" strokecolor="red" strokeweight="2pt">
                       <v:fill opacity="0"/>
@@ -6623,13 +6529,29 @@
             </w:r>
             <w:proofErr w:type="gramEnd"/>
             <w:r>
-              <w:t xml:space="preserve"> version of Rscript, which is stored in the </w:t>
+              <w:t xml:space="preserve"> version of </w:t>
+            </w:r>
+            <w:proofErr w:type="spellStart"/>
+            <w:r>
+              <w:t>Rscript</w:t>
+            </w:r>
+            <w:proofErr w:type="spellEnd"/>
+            <w:r>
+              <w:t xml:space="preserve">, which is stored in the </w:t>
             </w:r>
             <w:r>
               <w:t xml:space="preserve">x64 </w:t>
             </w:r>
             <w:r>
-              <w:t>folder within your R version bin folder. Also navigate to and select the OpCost script file (10_1_</w:t>
+              <w:t xml:space="preserve">folder within your R version bin folder. Also navigate to and select the </w:t>
+            </w:r>
+            <w:proofErr w:type="spellStart"/>
+            <w:r>
+              <w:t>OpCost</w:t>
+            </w:r>
+            <w:proofErr w:type="spellEnd"/>
+            <w:r>
+              <w:t xml:space="preserve"> script file (10_1_</w:t>
             </w:r>
             <w:proofErr w:type="gramStart"/>
             <w:r>
@@ -6640,26 +6562,43 @@
             </w:r>
             <w:proofErr w:type="gramEnd"/>
             <w:r>
-              <w:t xml:space="preserve"> as of this version of BioSum); it can be found in the </w:t>
-            </w:r>
-            <w:r>
-              <w:t xml:space="preserve">C:\Program </w:t>
-            </w:r>
-            <w:r>
-              <w:lastRenderedPageBreak/>
-              <w:t>Files\FIA PNW Portland Forestry Sciences Lab\FIA Biosum 5.</w:t>
-            </w:r>
-            <w:r>
-              <w:t>11</w:t>
-            </w:r>
-            <w:r>
-              <w:t>.</w:t>
-            </w:r>
-            <w:r>
-              <w:t>1</w:t>
-            </w:r>
-            <w:r>
-              <w:t>\opcost\</w:t>
+              <w:t xml:space="preserve"> as of this version of </w:t>
+            </w:r>
+            <w:proofErr w:type="spellStart"/>
+            <w:r>
+              <w:t>BioSum</w:t>
+            </w:r>
+            <w:proofErr w:type="spellEnd"/>
+            <w:r>
+              <w:t xml:space="preserve">); it can be found in the </w:t>
+            </w:r>
+            <w:r>
+              <w:t xml:space="preserve">C:\Program Files\FIA PNW Portland Forestry Sciences Lab\FIA </w:t>
+            </w:r>
+            <w:proofErr w:type="spellStart"/>
+            <w:r>
+              <w:t>Biosum</w:t>
+            </w:r>
+            <w:proofErr w:type="spellEnd"/>
+            <w:r>
+              <w:t xml:space="preserve"> </w:t>
+            </w:r>
+            <w:r>
+              <w:t>5.</w:t>
+            </w:r>
+            <w:r>
+              <w:t>13.0</w:t>
+            </w:r>
+            <w:r>
+              <w:t>\</w:t>
+            </w:r>
+            <w:proofErr w:type="spellStart"/>
+            <w:r>
+              <w:t>opcost</w:t>
+            </w:r>
+            <w:proofErr w:type="spellEnd"/>
+            <w:r>
+              <w:t>\</w:t>
             </w:r>
             <w:r>
               <w:t xml:space="preserve"> folder.  Then click &lt;Save&gt; to save these choices, then &lt;OK&gt; to close the Settings window.</w:t>
@@ -6684,7 +6623,6 @@
               <w:rPr>
                 <w:noProof/>
               </w:rPr>
-              <w:lastRenderedPageBreak/>
               <mc:AlternateContent>
                 <mc:Choice Requires="wps">
                   <w:drawing>
@@ -6746,7 +6684,7 @@
                     </wp:anchor>
                   </w:drawing>
                 </mc:Choice>
-                <mc:Fallback>
+                <mc:Fallback xmlns:w16sdtfl="http://schemas.microsoft.com/office/word/2024/wordml/sdtformatlock" xmlns:w16du="http://schemas.microsoft.com/office/word/2023/wordml/word16du" xmlns:oel="http://schemas.microsoft.com/office/2019/extlst">
                   <w:pict>
                     <v:oval w14:anchorId="36A763D3" id="Oval 86" o:spid="_x0000_s1026" style="position:absolute;margin-left:196.45pt;margin-top:41.15pt;width:61.2pt;height:24pt;z-index:251766784;visibility:visible;mso-wrap-style:square;mso-width-percent:0;mso-height-percent:0;mso-wrap-distance-left:9pt;mso-wrap-distance-top:0;mso-wrap-distance-right:9pt;mso-wrap-distance-bottom:0;mso-position-horizontal:absolute;mso-position-horizontal-relative:text;mso-position-vertical:absolute;mso-position-vertical-relative:text;mso-width-percent:0;mso-height-percent:0;mso-width-relative:page;mso-height-relative:page;v-text-anchor:top" o:gfxdata="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" strokecolor="red" strokeweight="2pt">
                       <v:fill opacity="0"/>
@@ -6820,7 +6758,7 @@
                     </wp:anchor>
                   </w:drawing>
                 </mc:Choice>
-                <mc:Fallback>
+                <mc:Fallback xmlns:w16sdtfl="http://schemas.microsoft.com/office/word/2024/wordml/sdtformatlock" xmlns:w16du="http://schemas.microsoft.com/office/word/2023/wordml/word16du" xmlns:oel="http://schemas.microsoft.com/office/2019/extlst">
                   <w:pict>
                     <v:oval w14:anchorId="57AF9F8B" id="Oval 86" o:spid="_x0000_s1026" style="position:absolute;margin-left:20.05pt;margin-top:37.15pt;width:53.4pt;height:24pt;z-index:251768832;visibility:visible;mso-wrap-style:square;mso-width-percent:0;mso-height-percent:0;mso-wrap-distance-left:9pt;mso-wrap-distance-top:0;mso-wrap-distance-right:9pt;mso-wrap-distance-bottom:0;mso-position-horizontal:absolute;mso-position-horizontal-relative:text;mso-position-vertical:absolute;mso-position-vertical-relative:text;mso-width-percent:0;mso-height-percent:0;mso-width-relative:page;mso-height-relative:page;v-text-anchor:top" o:gfxdata="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" strokecolor="red" strokeweight="2pt">
                       <v:fill opacity="0"/>
@@ -6894,7 +6832,7 @@
                     </wp:anchor>
                   </w:drawing>
                 </mc:Choice>
-                <mc:Fallback>
+                <mc:Fallback xmlns:w16sdtfl="http://schemas.microsoft.com/office/word/2024/wordml/sdtformatlock" xmlns:w16du="http://schemas.microsoft.com/office/word/2023/wordml/word16du" xmlns:oel="http://schemas.microsoft.com/office/2019/extlst">
                   <w:pict>
                     <v:oval w14:anchorId="649679F9" id="Oval 86" o:spid="_x0000_s1026" style="position:absolute;margin-left:1.05pt;margin-top:271.15pt;width:268.8pt;height:22.2pt;z-index:251762688;visibility:visible;mso-wrap-style:square;mso-width-percent:0;mso-height-percent:0;mso-wrap-distance-left:9pt;mso-wrap-distance-top:0;mso-wrap-distance-right:9pt;mso-wrap-distance-bottom:0;mso-position-horizontal:absolute;mso-position-horizontal-relative:text;mso-position-vertical:absolute;mso-position-vertical-relative:text;mso-width-percent:0;mso-height-percent:0;mso-width-relative:page;mso-height-relative:page;v-text-anchor:top" o:gfxdata="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" strokecolor="red" strokeweight="2pt">
                       <v:fill opacity="0"/>
@@ -6968,7 +6906,7 @@
                     </wp:anchor>
                   </w:drawing>
                 </mc:Choice>
-                <mc:Fallback>
+                <mc:Fallback xmlns:w16sdtfl="http://schemas.microsoft.com/office/word/2024/wordml/sdtformatlock" xmlns:w16du="http://schemas.microsoft.com/office/word/2023/wordml/word16du" xmlns:oel="http://schemas.microsoft.com/office/2019/extlst">
                   <w:pict>
                     <v:oval w14:anchorId="0DE1204E" id="Oval 86" o:spid="_x0000_s1026" style="position:absolute;margin-left:5.4pt;margin-top:307pt;width:328.85pt;height:26.4pt;z-index:251764736;visibility:visible;mso-wrap-style:square;mso-width-percent:0;mso-height-percent:0;mso-wrap-distance-left:9pt;mso-wrap-distance-top:0;mso-wrap-distance-right:9pt;mso-wrap-distance-bottom:0;mso-position-horizontal:absolute;mso-position-horizontal-relative:text;mso-position-vertical:absolute;mso-position-vertical-relative:text;mso-width-percent:0;mso-height-percent:0;mso-width-relative:page;mso-height-relative:page;v-text-anchor:top" o:gfxdata="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" strokecolor="red" strokeweight="2pt">
                       <v:fill opacity="0"/>
@@ -7063,7 +7001,6 @@
               <w:rPr>
                 <w:noProof/>
               </w:rPr>
-              <w:lastRenderedPageBreak/>
               <mc:AlternateContent>
                 <mc:Choice Requires="wps">
                   <w:drawing>
@@ -7125,7 +7062,7 @@
                     </wp:anchor>
                   </w:drawing>
                 </mc:Choice>
-                <mc:Fallback>
+                <mc:Fallback xmlns:w16sdtfl="http://schemas.microsoft.com/office/word/2024/wordml/sdtformatlock" xmlns:w16du="http://schemas.microsoft.com/office/word/2023/wordml/word16du" xmlns:oel="http://schemas.microsoft.com/office/2019/extlst">
                   <w:pict>
                     <v:oval w14:anchorId="4DA740DF" id="Oval 86" o:spid="_x0000_s1026" style="position:absolute;margin-left:68.9pt;margin-top:48.35pt;width:268.8pt;height:22.2pt;z-index:251770880;visibility:visible;mso-wrap-style:square;mso-width-percent:0;mso-height-percent:0;mso-wrap-distance-left:9pt;mso-wrap-distance-top:0;mso-wrap-distance-right:9pt;mso-wrap-distance-bottom:0;mso-position-horizontal:absolute;mso-position-horizontal-relative:text;mso-position-vertical:absolute;mso-position-vertical-relative:text;mso-width-percent:0;mso-height-percent:0;mso-width-relative:page;mso-height-relative:page;v-text-anchor:top" o:gfxdata="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" strokecolor="red" strokeweight="2pt">
                       <v:fill opacity="0"/>
@@ -7299,7 +7236,7 @@
                     </wp:anchor>
                   </w:drawing>
                 </mc:Choice>
-                <mc:Fallback>
+                <mc:Fallback xmlns:w16sdtfl="http://schemas.microsoft.com/office/word/2024/wordml/sdtformatlock" xmlns:w16du="http://schemas.microsoft.com/office/word/2023/wordml/word16du" xmlns:oel="http://schemas.microsoft.com/office/2019/extlst">
                   <w:pict>
                     <v:oval w14:anchorId="52E56A40" id="Oval 86" o:spid="_x0000_s1026" style="position:absolute;margin-left:127.9pt;margin-top:181.15pt;width:53.4pt;height:24pt;z-index:251772928;visibility:visible;mso-wrap-style:square;mso-width-percent:0;mso-height-percent:0;mso-wrap-distance-left:9pt;mso-wrap-distance-top:0;mso-wrap-distance-right:9pt;mso-wrap-distance-bottom:0;mso-position-horizontal:absolute;mso-position-horizontal-relative:text;mso-position-vertical:absolute;mso-position-vertical-relative:text;mso-width-percent:0;mso-height-percent:0;mso-width-relative:page;mso-height-relative:page;v-text-anchor:top" o:gfxdata="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" strokecolor="red" strokeweight="2pt">
                       <v:fill opacity="0"/>
@@ -7476,7 +7413,7 @@
                     </wp:anchor>
                   </w:drawing>
                 </mc:Choice>
-                <mc:Fallback>
+                <mc:Fallback xmlns:w16sdtfl="http://schemas.microsoft.com/office/word/2024/wordml/sdtformatlock" xmlns:w16du="http://schemas.microsoft.com/office/word/2023/wordml/word16du" xmlns:oel="http://schemas.microsoft.com/office/2019/extlst">
                   <w:pict>
                     <v:oval w14:anchorId="7F82AFAE" id="Oval 86" o:spid="_x0000_s1026" style="position:absolute;margin-left:232.2pt;margin-top:125pt;width:156pt;height:97.2pt;z-index:251774976;visibility:visible;mso-wrap-style:square;mso-width-percent:0;mso-height-percent:0;mso-wrap-distance-left:9pt;mso-wrap-distance-top:0;mso-wrap-distance-right:9pt;mso-wrap-distance-bottom:0;mso-position-horizontal:absolute;mso-position-horizontal-relative:text;mso-position-vertical:absolute;mso-position-vertical-relative:text;mso-width-percent:0;mso-height-percent:0;mso-width-relative:page;mso-height-relative:page;v-text-anchor:top" o:gfxdata="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" strokecolor="red" strokeweight="2pt">
                       <v:fill opacity="0"/>
@@ -7533,8 +7470,8 @@
       <w:pPr>
         <w:pStyle w:val="Heading1"/>
       </w:pPr>
-      <w:bookmarkStart w:id="3" w:name="_Appendix:_How_to"/>
-      <w:bookmarkEnd w:id="3"/>
+      <w:bookmarkStart w:id="2" w:name="_Appendix:_How_to"/>
+      <w:bookmarkEnd w:id="2"/>
       <w:r>
         <w:lastRenderedPageBreak/>
         <w:t xml:space="preserve">Appendix </w:t>
@@ -7601,7 +7538,15 @@
         <w:t xml:space="preserve">External users need to install Java 1.8 or higher. </w:t>
       </w:r>
       <w:r>
-        <w:t xml:space="preserve">This is essential for BioSum to calculate volume and biomass of the trees </w:t>
+        <w:t xml:space="preserve">This is essential for </w:t>
+      </w:r>
+      <w:proofErr w:type="spellStart"/>
+      <w:r>
+        <w:t>BioSum</w:t>
+      </w:r>
+      <w:proofErr w:type="spellEnd"/>
+      <w:r>
+        <w:t xml:space="preserve"> to calculate volume and biomass of the trees </w:t>
       </w:r>
       <w:r>
         <w:t xml:space="preserve">in the inventory sample </w:t>
@@ -7624,7 +7569,21 @@
         </w:numPr>
       </w:pPr>
       <w:r>
-        <w:t xml:space="preserve">The first time BioSum runs, it copies these 4 files to the %APPDATA% directory: </w:t>
+        <w:t xml:space="preserve">The first time </w:t>
+      </w:r>
+      <w:proofErr w:type="spellStart"/>
+      <w:r>
+        <w:t>BioSum</w:t>
+      </w:r>
+      <w:proofErr w:type="spellEnd"/>
+      <w:r>
+        <w:t xml:space="preserve"> runs, it copies these </w:t>
+      </w:r>
+      <w:r>
+        <w:t>3</w:t>
+      </w:r>
+      <w:r>
+        <w:t xml:space="preserve"> files to the %APPDATA% directory: </w:t>
       </w:r>
     </w:p>
     <w:p>
@@ -7646,21 +7605,23 @@
         </w:numPr>
         <w:ind w:left="1800"/>
       </w:pPr>
+      <w:bookmarkStart w:id="3" w:name="_Hlk226623767"/>
       <w:r>
         <w:rPr>
           <w:rFonts w:ascii="Courier New" w:hAnsi="Courier New" w:cs="Courier New"/>
           <w:b/>
           <w:bCs/>
         </w:rPr>
-        <w:t>B</w:t>
-      </w:r>
+        <w:t>FIA_TreeVBC.jar</w:t>
+      </w:r>
+      <w:bookmarkEnd w:id="3"/>
       <w:r>
         <w:rPr>
           <w:rFonts w:ascii="Courier New" w:hAnsi="Courier New" w:cs="Courier New"/>
           <w:b/>
           <w:bCs/>
         </w:rPr>
-        <w:t xml:space="preserve">ioSumComps.jar, </w:t>
+        <w:t xml:space="preserve">, </w:t>
       </w:r>
     </w:p>
     <w:p>
@@ -7683,13 +7644,23 @@
         </w:numPr>
         <w:ind w:left="1800"/>
       </w:pPr>
+      <w:proofErr w:type="spellStart"/>
       <w:r>
         <w:rPr>
           <w:rFonts w:ascii="Courier New" w:hAnsi="Courier New" w:cs="Courier New"/>
           <w:b/>
           <w:bCs/>
         </w:rPr>
-        <w:t xml:space="preserve">BiosumSpeciesConfig.db, </w:t>
+        <w:t>tvbc_tree_data.db</w:t>
+      </w:r>
+      <w:proofErr w:type="spellEnd"/>
+      <w:r>
+        <w:rPr>
+          <w:rFonts w:ascii="Courier New" w:hAnsi="Courier New" w:cs="Courier New"/>
+          <w:b/>
+          <w:bCs/>
+        </w:rPr>
+        <w:t xml:space="preserve">, and </w:t>
       </w:r>
     </w:p>
     <w:p>
@@ -7718,36 +7689,15 @@
           <w:b/>
           <w:bCs/>
         </w:rPr>
-        <w:t xml:space="preserve">fcs_tree.db, and </w:t>
-      </w:r>
-    </w:p>
-    <w:p>
-      <w:pPr>
-        <w:pStyle w:val="ListParagraph"/>
-        <w:ind w:left="1440"/>
+        <w:t>tvbc_tree_calc.bat</w:t>
+      </w:r>
+      <w:r>
         <w:rPr>
           <w:rFonts w:ascii="Courier New" w:hAnsi="Courier New" w:cs="Courier New"/>
           <w:b/>
           <w:bCs/>
         </w:rPr>
-      </w:pPr>
-    </w:p>
-    <w:p>
-      <w:pPr>
-        <w:pStyle w:val="ListParagraph"/>
-        <w:numPr>
-          <w:ilvl w:val="0"/>
-          <w:numId w:val="18"/>
-        </w:numPr>
-        <w:ind w:left="1800"/>
-      </w:pPr>
-      <w:r>
-        <w:rPr>
-          <w:rFonts w:ascii="Courier New" w:hAnsi="Courier New" w:cs="Courier New"/>
-          <w:b/>
-          <w:bCs/>
-        </w:rPr>
-        <w:t xml:space="preserve">fcs_tree_calc.bat. </w:t>
+        <w:t xml:space="preserve">. </w:t>
       </w:r>
     </w:p>
     <w:p>
@@ -7765,7 +7715,29 @@
         </w:numPr>
       </w:pPr>
       <w:r>
-        <w:t>To test the functioning of the Java client, open a cmd window and type:</w:t>
+        <w:t xml:space="preserve">To test the functioning of the Java client, open a </w:t>
+      </w:r>
+      <w:proofErr w:type="spellStart"/>
+      <w:r>
+        <w:t>cmd</w:t>
+      </w:r>
+      <w:proofErr w:type="spellEnd"/>
+      <w:r>
+        <w:t xml:space="preserve"> window and type</w:t>
+      </w:r>
+      <w:r>
+        <w:t xml:space="preserve"> (where %APPDATA% is the path to your </w:t>
+      </w:r>
+      <w:proofErr w:type="spellStart"/>
+      <w:r>
+        <w:t>AppData</w:t>
+      </w:r>
+      <w:proofErr w:type="spellEnd"/>
+      <w:r>
+        <w:t xml:space="preserve"> directory</w:t>
+      </w:r>
+      <w:r>
+        <w:t>:</w:t>
       </w:r>
     </w:p>
     <w:p>
@@ -7783,44 +7755,78 @@
           <w:sz w:val="18"/>
           <w:szCs w:val="18"/>
         </w:rPr>
-        <w:t>JAVA -jar "%APPDATA%"/FIABiosum/BiosumComps.jar</w:t>
-      </w:r>
+        <w:t>JAVA -jar "%APPDATA%/</w:t>
+      </w:r>
+      <w:proofErr w:type="spellStart"/>
       <w:r>
         <w:rPr>
           <w:rFonts w:ascii="Courier New" w:hAnsi="Courier New" w:cs="Courier New"/>
           <w:sz w:val="18"/>
           <w:szCs w:val="18"/>
         </w:rPr>
-        <w:t xml:space="preserve"> -v</w:t>
-      </w:r>
-    </w:p>
-    <w:p>
-      <w:pPr>
-        <w:ind w:left="1440"/>
-      </w:pPr>
-    </w:p>
-    <w:p>
-      <w:pPr>
-        <w:ind w:left="1440"/>
-      </w:pPr>
-      <w:r>
-        <w:t>If all is well, you’ll see a response like:</w:t>
-      </w:r>
-    </w:p>
-    <w:p>
-      <w:pPr>
-        <w:ind w:left="1440"/>
-        <w:rPr>
-          <w:rFonts w:ascii="Courier New" w:hAnsi="Courier New" w:cs="Courier New"/>
-        </w:rPr>
-      </w:pPr>
+        <w:t>FIABiosum</w:t>
+      </w:r>
+      <w:proofErr w:type="spellEnd"/>
       <w:r>
         <w:rPr>
           <w:rFonts w:ascii="Courier New" w:hAnsi="Courier New" w:cs="Courier New"/>
           <w:sz w:val="18"/>
           <w:szCs w:val="18"/>
         </w:rPr>
-        <w:t>Biosum FICS Client version 0.3.04</w:t>
+        <w:t>/</w:t>
+      </w:r>
+      <w:r>
+        <w:rPr>
+          <w:rFonts w:ascii="Courier New" w:hAnsi="Courier New" w:cs="Courier New"/>
+          <w:sz w:val="18"/>
+          <w:szCs w:val="18"/>
+        </w:rPr>
+        <w:t>FIA_TreeVBC.jar</w:t>
+      </w:r>
+      <w:r>
+        <w:rPr>
+          <w:rFonts w:ascii="Courier New" w:hAnsi="Courier New" w:cs="Courier New"/>
+          <w:sz w:val="18"/>
+          <w:szCs w:val="18"/>
+        </w:rPr>
+        <w:t>”</w:t>
+      </w:r>
+      <w:r>
+        <w:rPr>
+          <w:rFonts w:ascii="Courier New" w:hAnsi="Courier New" w:cs="Courier New"/>
+          <w:sz w:val="18"/>
+          <w:szCs w:val="18"/>
+        </w:rPr>
+        <w:t xml:space="preserve"> -v</w:t>
+      </w:r>
+    </w:p>
+    <w:p>
+      <w:pPr>
+        <w:ind w:left="1440"/>
+      </w:pPr>
+    </w:p>
+    <w:p>
+      <w:pPr>
+        <w:ind w:left="1440"/>
+      </w:pPr>
+      <w:r>
+        <w:t>If all is well, you’ll see a response like:</w:t>
+      </w:r>
+    </w:p>
+    <w:p>
+      <w:pPr>
+        <w:ind w:left="1440"/>
+        <w:rPr>
+          <w:rFonts w:ascii="Courier New" w:hAnsi="Courier New" w:cs="Courier New"/>
+        </w:rPr>
+      </w:pPr>
+      <w:r>
+        <w:rPr>
+          <w:rFonts w:ascii="Courier New" w:hAnsi="Courier New" w:cs="Courier New"/>
+          <w:sz w:val="18"/>
+          <w:szCs w:val="18"/>
+        </w:rPr>
+        <w:t>FIA TVBC Version 1.1 01/15/2025</w:t>
       </w:r>
       <w:r>
         <w:rPr>
@@ -7839,7 +7845,13 @@
         </w:numPr>
       </w:pPr>
       <w:r>
-        <w:t xml:space="preserve">If all is not well, check to make sure that the 4 files mentioned in step 2 are in the </w:t>
+        <w:t xml:space="preserve">If all is not well, check to make sure that the </w:t>
+      </w:r>
+      <w:r>
+        <w:t>3</w:t>
+      </w:r>
+      <w:r>
+        <w:t xml:space="preserve"> files mentioned in step 2 are in the </w:t>
       </w:r>
       <w:bookmarkStart w:id="4" w:name="_Hlk100316485"/>
       <w:r>
@@ -7853,7 +7865,23 @@
         <w:t xml:space="preserve">%APPDATA% </w:t>
       </w:r>
       <w:r>
-        <w:t xml:space="preserve">directory, start BioSum and click on the ‘Settings’ menu item at the top of the BioSum </w:t>
+        <w:t xml:space="preserve">directory, start </w:t>
+      </w:r>
+      <w:proofErr w:type="spellStart"/>
+      <w:r>
+        <w:t>BioSum</w:t>
+      </w:r>
+      <w:proofErr w:type="spellEnd"/>
+      <w:r>
+        <w:t xml:space="preserve"> and click on the ‘Settings’ menu item at the top of the </w:t>
+      </w:r>
+      <w:proofErr w:type="spellStart"/>
+      <w:r>
+        <w:t>BioSum</w:t>
+      </w:r>
+      <w:proofErr w:type="spellEnd"/>
+      <w:r>
+        <w:t xml:space="preserve"> </w:t>
       </w:r>
       <w:r>
         <w:t>to</w:t>
@@ -7865,25 +7893,69 @@
         <w:t>review</w:t>
       </w:r>
       <w:r>
-        <w:t xml:space="preserve"> the path to the BioSum settings folder.</w:t>
+        <w:t xml:space="preserve"> the path to the </w:t>
+      </w:r>
+      <w:proofErr w:type="spellStart"/>
+      <w:r>
+        <w:t>BioSum</w:t>
+      </w:r>
+      <w:proofErr w:type="spellEnd"/>
+      <w:r>
+        <w:t xml:space="preserve"> settings folder.</w:t>
       </w:r>
       <w:r>
         <w:t xml:space="preserve"> If any of these files are missing, they can be copied from </w:t>
       </w:r>
       <w:r>
-        <w:t>C:\Program Files\FIA PNW Portland Forestry Sciences Lab\FIA Biosum 5.</w:t>
-      </w:r>
-      <w:r>
-        <w:t>9.0</w:t>
-      </w:r>
-      <w:r>
-        <w:t>\fcs (after installing the BioSum 5.</w:t>
-      </w:r>
-      <w:r>
-        <w:t>9.0</w:t>
-      </w:r>
-      <w:r>
-        <w:t xml:space="preserve"> msi)</w:t>
+        <w:t xml:space="preserve">C:\Program Files\FIA PNW Portland Forestry Sciences Lab\FIA </w:t>
+      </w:r>
+      <w:proofErr w:type="spellStart"/>
+      <w:r>
+        <w:t>Biosum</w:t>
+      </w:r>
+      <w:proofErr w:type="spellEnd"/>
+      <w:r>
+        <w:t xml:space="preserve"> 5.</w:t>
+      </w:r>
+      <w:r>
+        <w:t>13</w:t>
+      </w:r>
+      <w:r>
+        <w:t>.0</w:t>
+      </w:r>
+      <w:r>
+        <w:t>\</w:t>
+      </w:r>
+      <w:r>
+        <w:t>tvbc</w:t>
+      </w:r>
+      <w:r>
+        <w:t xml:space="preserve"> (after installing the </w:t>
+      </w:r>
+      <w:proofErr w:type="spellStart"/>
+      <w:r>
+        <w:t>BioSum</w:t>
+      </w:r>
+      <w:proofErr w:type="spellEnd"/>
+      <w:r>
+        <w:t xml:space="preserve"> 5.</w:t>
+      </w:r>
+      <w:r>
+        <w:t>13</w:t>
+      </w:r>
+      <w:r>
+        <w:t>.0</w:t>
+      </w:r>
+      <w:r>
+        <w:t xml:space="preserve"> </w:t>
+      </w:r>
+      <w:proofErr w:type="spellStart"/>
+      <w:r>
+        <w:t>msi</w:t>
+      </w:r>
+      <w:proofErr w:type="spellEnd"/>
+      <w:r>
+        <w:t>)</w:t>
       </w:r>
       <w:r>
         <w:t xml:space="preserve">. Once these files are in place, </w:t>
@@ -7913,7 +7985,15 @@
         </w:numPr>
       </w:pPr>
       <w:r>
-        <w:t>If all is still not well, there may be a problem with your Java installation. Open a cmd window and type:</w:t>
+        <w:t xml:space="preserve">If all is still not well, there may be a problem with your Java installation. Open a </w:t>
+      </w:r>
+      <w:proofErr w:type="spellStart"/>
+      <w:r>
+        <w:t>cmd</w:t>
+      </w:r>
+      <w:proofErr w:type="spellEnd"/>
+      <w:r>
+        <w:t xml:space="preserve"> window and type:</w:t>
       </w:r>
     </w:p>
     <w:p>
@@ -7951,13 +8031,23 @@
           <w:szCs w:val="18"/>
         </w:rPr>
       </w:pPr>
+      <w:proofErr w:type="spellStart"/>
       <w:r>
         <w:rPr>
           <w:rFonts w:ascii="Courier New" w:hAnsi="Courier New" w:cs="Courier New"/>
           <w:sz w:val="18"/>
           <w:szCs w:val="18"/>
         </w:rPr>
-        <w:t>openjdk version "1.8.0_265"</w:t>
+        <w:t>openjdk</w:t>
+      </w:r>
+      <w:proofErr w:type="spellEnd"/>
+      <w:r>
+        <w:rPr>
+          <w:rFonts w:ascii="Courier New" w:hAnsi="Courier New" w:cs="Courier New"/>
+          <w:sz w:val="18"/>
+          <w:szCs w:val="18"/>
+        </w:rPr>
+        <w:t xml:space="preserve"> version "1.8.0_265"</w:t>
       </w:r>
     </w:p>
     <w:p>
@@ -8018,13 +8108,8 @@
       <w:r>
         <w:t xml:space="preserve"> updated. </w:t>
       </w:r>
-      <w:proofErr w:type="gramStart"/>
-      <w:r>
-        <w:t>Return again</w:t>
-      </w:r>
-      <w:proofErr w:type="gramEnd"/>
-      <w:r>
-        <w:t xml:space="preserve"> to</w:t>
+      <w:r>
+        <w:t>Return again to</w:t>
       </w:r>
       <w:r>
         <w:t xml:space="preserve"> step </w:t>
@@ -8048,7 +8133,15 @@
         </w:numPr>
       </w:pPr>
       <w:r>
-        <w:t>If you believe your Java installation is good, but BioSum is still having trouble running the Tree Troubleshooter, try setting your JAVA_HOME environment variable to your Java bin directory:</w:t>
+        <w:t xml:space="preserve">If you believe your Java installation is good, but </w:t>
+      </w:r>
+      <w:proofErr w:type="spellStart"/>
+      <w:r>
+        <w:t>BioSum</w:t>
+      </w:r>
+      <w:proofErr w:type="spellEnd"/>
+      <w:r>
+        <w:t xml:space="preserve"> is still having trouble running the Tree Troubleshooter, try setting your JAVA_HOME environment variable to your Java bin directory:</w:t>
       </w:r>
     </w:p>
     <w:p>
@@ -8074,7 +8167,15 @@
         <w:spacing w:after="120"/>
       </w:pPr>
       <w:r>
-        <w:t>Type sysdm.cpl &lt;Enter&gt;</w:t>
+        <w:t xml:space="preserve">Type </w:t>
+      </w:r>
+      <w:proofErr w:type="spellStart"/>
+      <w:r>
+        <w:t>sysdm.cpl</w:t>
+      </w:r>
+      <w:proofErr w:type="spellEnd"/>
+      <w:r>
+        <w:t xml:space="preserve"> &lt;Enter&gt;</w:t>
       </w:r>
     </w:p>
     <w:p>
@@ -8087,7 +8188,6 @@
         <w:spacing w:after="120"/>
       </w:pPr>
       <w:r>
-        <w:lastRenderedPageBreak/>
         <w:t>Click the &lt;Advanced&gt; tab</w:t>
       </w:r>
     </w:p>
@@ -8101,6 +8201,7 @@
         <w:spacing w:after="120"/>
       </w:pPr>
       <w:r>
+        <w:lastRenderedPageBreak/>
         <w:t>Click the button &lt;Environment Variables&gt;</w:t>
       </w:r>
     </w:p>
@@ -8238,19 +8339,51 @@
       </w:pPr>
       <w:r>
         <w:lastRenderedPageBreak/>
-        <w:t>Appendix 2: Installing FIA BioSum on a Virtual Machine (VM)</w:t>
+        <w:t xml:space="preserve">Appendix 2: Installing FIA </w:t>
+      </w:r>
+      <w:proofErr w:type="spellStart"/>
+      <w:r>
+        <w:t>BioSum</w:t>
+      </w:r>
+      <w:proofErr w:type="spellEnd"/>
+      <w:r>
+        <w:t xml:space="preserve"> on a Virtual Machine (VM)</w:t>
       </w:r>
     </w:p>
     <w:p/>
     <w:p>
       <w:r>
-        <w:t>While BioSum has been run by some users on virtual machines, we don’t recommend this approach, and do not commit to supporting it, as it increase the complexity of the software environment and can make it more difficult to troubleshoot issues that arise (the developers do not have virtual environments to test in and the BioSum development project does not have the resources to fully support users who attempt this).</w:t>
+        <w:t xml:space="preserve">While </w:t>
+      </w:r>
+      <w:proofErr w:type="spellStart"/>
+      <w:r>
+        <w:t>BioSum</w:t>
+      </w:r>
+      <w:proofErr w:type="spellEnd"/>
+      <w:r>
+        <w:t xml:space="preserve"> has been run by some users on virtual machines, we don’t recommend this approach, and do not commit to supporting it, as it increase the complexity of the software environment and can make it more difficult to troubleshoot issues that arise (the developers do not have virtual environments to test in and the </w:t>
+      </w:r>
+      <w:proofErr w:type="spellStart"/>
+      <w:r>
+        <w:t>BioSum</w:t>
+      </w:r>
+      <w:proofErr w:type="spellEnd"/>
+      <w:r>
+        <w:t xml:space="preserve"> development project does not have the resources to fully support users who attempt this).</w:t>
       </w:r>
     </w:p>
     <w:p/>
     <w:p>
       <w:r>
-        <w:t xml:space="preserve"> In our attempts to support those who despite these challenges attempt to run BioSum in a virtual machine (e.g., on a Mac), here are some helpful tips:</w:t>
+        <w:t xml:space="preserve"> In our attempts to support those who despite these challenges attempt to run </w:t>
+      </w:r>
+      <w:proofErr w:type="spellStart"/>
+      <w:r>
+        <w:t>BioSum</w:t>
+      </w:r>
+      <w:proofErr w:type="spellEnd"/>
+      <w:r>
+        <w:t xml:space="preserve"> in a virtual machine (e.g., on a Mac), here are some helpful tips:</w:t>
       </w:r>
     </w:p>
     <w:p/>
@@ -8299,7 +8432,23 @@
         </w:numPr>
       </w:pPr>
       <w:r>
-        <w:t>File permissions can be an issue when BioSum tries to connect to existing SQLite databases because Windows has one way of managing these and your VM may have another. It is best practice to install BioSum as the same user who will be using the program, NOT as admin. Also, the Access DB engine and SQLite driver may need to be installed by the same user who will be using BioSum.</w:t>
+        <w:t xml:space="preserve">File permissions can be an issue when </w:t>
+      </w:r>
+      <w:proofErr w:type="spellStart"/>
+      <w:r>
+        <w:t>BioSum</w:t>
+      </w:r>
+      <w:proofErr w:type="spellEnd"/>
+      <w:r>
+        <w:t xml:space="preserve"> tries to connect to existing SQLite databases because Windows has one way of managing these and your VM may have another. It is best practice to install </w:t>
+      </w:r>
+      <w:proofErr w:type="spellStart"/>
+      <w:r>
+        <w:t>BioSum</w:t>
+      </w:r>
+      <w:proofErr w:type="spellEnd"/>
+      <w:r>
+        <w:t xml:space="preserve"> as the same user who will be using the program, NOT as admin. </w:t>
       </w:r>
     </w:p>
     <w:sectPr>
@@ -8323,7 +8472,7 @@
 </file>
 
 <file path=word/endnotes.xml><?xml version="1.0" encoding="utf-8"?>
-<w:endnotes xmlns:wpc="http://schemas.microsoft.com/office/word/2010/wordprocessingCanvas" xmlns:cx="http://schemas.microsoft.com/office/drawing/2014/chartex" xmlns:cx1="http://schemas.microsoft.com/office/drawing/2015/9/8/chartex" xmlns:cx2="http://schemas.microsoft.com/office/drawing/2015/10/21/chartex" xmlns:cx3="http://schemas.microsoft.com/office/drawing/2016/5/9/chartex" xmlns:cx4="http://schemas.microsoft.com/office/drawing/2016/5/10/chartex" xmlns:cx5="http://schemas.microsoft.com/office/drawing/2016/5/11/chartex" xmlns:cx6="http://schemas.microsoft.com/office/drawing/2016/5/12/chartex" xmlns:cx7="http://schemas.microsoft.com/office/drawing/2016/5/13/chartex" xmlns:cx8="http://schemas.microsoft.com/office/drawing/2016/5/14/chartex" xmlns:mc="http://schemas.openxmlformats.org/markup-compatibility/2006" xmlns:aink="http://schemas.microsoft.com/office/drawing/2016/ink" xmlns:am3d="http://schemas.microsoft.com/office/drawing/2017/model3d" xmlns:o="urn:schemas-microsoft-com:office:office" xmlns:oel="http://schemas.microsoft.com/office/2019/extlst" xmlns:r="http://schemas.openxmlformats.org/officeDocument/2006/relationships" xmlns:m="http://schemas.openxmlformats.org/officeDocument/2006/math" xmlns:v="urn:schemas-microsoft-com:vml" xmlns:wp14="http://schemas.microsoft.com/office/word/2010/wordprocessingDrawing" xmlns:wp="http://schemas.openxmlformats.org/drawingml/2006/wordprocessingDrawing" xmlns:w10="urn:schemas-microsoft-com:office:word" xmlns:w="http://schemas.openxmlformats.org/wordprocessingml/2006/main" xmlns:w14="http://schemas.microsoft.com/office/word/2010/wordml" xmlns:w15="http://schemas.microsoft.com/office/word/2012/wordml" xmlns:w16cex="http://schemas.microsoft.com/office/word/2018/wordml/cex" xmlns:w16cid="http://schemas.microsoft.com/office/word/2016/wordml/cid" xmlns:w16="http://schemas.microsoft.com/office/word/2018/wordml" xmlns:w16du="http://schemas.microsoft.com/office/word/2023/wordml/word16du" xmlns:w16sdtdh="http://schemas.microsoft.com/office/word/2020/wordml/sdtdatahash" xmlns:w16se="http://schemas.microsoft.com/office/word/2015/wordml/symex" xmlns:wpg="http://schemas.microsoft.com/office/word/2010/wordprocessingGroup" xmlns:wpi="http://schemas.microsoft.com/office/word/2010/wordprocessingInk" xmlns:wne="http://schemas.microsoft.com/office/word/2006/wordml" xmlns:wps="http://schemas.microsoft.com/office/word/2010/wordprocessingShape" mc:Ignorable="w14 w15 w16se w16cid w16 w16cex w16sdtdh w16du wp14">
+<w:endnotes xmlns:wpc="http://schemas.microsoft.com/office/word/2010/wordprocessingCanvas" xmlns:cx="http://schemas.microsoft.com/office/drawing/2014/chartex" xmlns:cx1="http://schemas.microsoft.com/office/drawing/2015/9/8/chartex" xmlns:cx2="http://schemas.microsoft.com/office/drawing/2015/10/21/chartex" xmlns:cx3="http://schemas.microsoft.com/office/drawing/2016/5/9/chartex" xmlns:cx4="http://schemas.microsoft.com/office/drawing/2016/5/10/chartex" xmlns:cx5="http://schemas.microsoft.com/office/drawing/2016/5/11/chartex" xmlns:cx6="http://schemas.microsoft.com/office/drawing/2016/5/12/chartex" xmlns:cx7="http://schemas.microsoft.com/office/drawing/2016/5/13/chartex" xmlns:cx8="http://schemas.microsoft.com/office/drawing/2016/5/14/chartex" xmlns:mc="http://schemas.openxmlformats.org/markup-compatibility/2006" xmlns:aink="http://schemas.microsoft.com/office/drawing/2016/ink" xmlns:am3d="http://schemas.microsoft.com/office/drawing/2017/model3d" xmlns:o="urn:schemas-microsoft-com:office:office" xmlns:r="http://schemas.openxmlformats.org/officeDocument/2006/relationships" xmlns:m="http://schemas.openxmlformats.org/officeDocument/2006/math" xmlns:v="urn:schemas-microsoft-com:vml" xmlns:wp14="http://schemas.microsoft.com/office/word/2010/wordprocessingDrawing" xmlns:wp="http://schemas.openxmlformats.org/drawingml/2006/wordprocessingDrawing" xmlns:w10="urn:schemas-microsoft-com:office:word" xmlns:w="http://schemas.openxmlformats.org/wordprocessingml/2006/main" xmlns:w14="http://schemas.microsoft.com/office/word/2010/wordml" xmlns:w15="http://schemas.microsoft.com/office/word/2012/wordml" xmlns:w16cex="http://schemas.microsoft.com/office/word/2018/wordml/cex" xmlns:w16cid="http://schemas.microsoft.com/office/word/2016/wordml/cid" xmlns:w16="http://schemas.microsoft.com/office/word/2018/wordml" xmlns:w16sdtdh="http://schemas.microsoft.com/office/word/2020/wordml/sdtdatahash" xmlns:w16se="http://schemas.microsoft.com/office/word/2015/wordml/symex" xmlns:wpg="http://schemas.microsoft.com/office/word/2010/wordprocessingGroup" xmlns:wpi="http://schemas.microsoft.com/office/word/2010/wordprocessingInk" xmlns:wne="http://schemas.microsoft.com/office/word/2006/wordml" xmlns:wps="http://schemas.microsoft.com/office/word/2010/wordprocessingShape" mc:Ignorable="w14 w15 w16se w16cid w16 w16cex w16sdtdh wp14">
   <w:endnote w:type="separator" w:id="-1">
     <w:p>
       <w:r>
@@ -8342,7 +8491,7 @@
 </file>
 
 <file path=word/footer1.xml><?xml version="1.0" encoding="utf-8"?>
-<w:ftr xmlns:wpc="http://schemas.microsoft.com/office/word/2010/wordprocessingCanvas" xmlns:cx="http://schemas.microsoft.com/office/drawing/2014/chartex" xmlns:cx1="http://schemas.microsoft.com/office/drawing/2015/9/8/chartex" xmlns:cx2="http://schemas.microsoft.com/office/drawing/2015/10/21/chartex" xmlns:cx3="http://schemas.microsoft.com/office/drawing/2016/5/9/chartex" xmlns:cx4="http://schemas.microsoft.com/office/drawing/2016/5/10/chartex" xmlns:cx5="http://schemas.microsoft.com/office/drawing/2016/5/11/chartex" xmlns:cx6="http://schemas.microsoft.com/office/drawing/2016/5/12/chartex" xmlns:cx7="http://schemas.microsoft.com/office/drawing/2016/5/13/chartex" xmlns:cx8="http://schemas.microsoft.com/office/drawing/2016/5/14/chartex" xmlns:mc="http://schemas.openxmlformats.org/markup-compatibility/2006" xmlns:aink="http://schemas.microsoft.com/office/drawing/2016/ink" xmlns:am3d="http://schemas.microsoft.com/office/drawing/2017/model3d" xmlns:o="urn:schemas-microsoft-com:office:office" xmlns:oel="http://schemas.microsoft.com/office/2019/extlst" xmlns:r="http://schemas.openxmlformats.org/officeDocument/2006/relationships" xmlns:m="http://schemas.openxmlformats.org/officeDocument/2006/math" xmlns:v="urn:schemas-microsoft-com:vml" xmlns:wp14="http://schemas.microsoft.com/office/word/2010/wordprocessingDrawing" xmlns:wp="http://schemas.openxmlformats.org/drawingml/2006/wordprocessingDrawing" xmlns:w10="urn:schemas-microsoft-com:office:word" xmlns:w="http://schemas.openxmlformats.org/wordprocessingml/2006/main" xmlns:w14="http://schemas.microsoft.com/office/word/2010/wordml" xmlns:w15="http://schemas.microsoft.com/office/word/2012/wordml" xmlns:w16cex="http://schemas.microsoft.com/office/word/2018/wordml/cex" xmlns:w16cid="http://schemas.microsoft.com/office/word/2016/wordml/cid" xmlns:w16="http://schemas.microsoft.com/office/word/2018/wordml" xmlns:w16du="http://schemas.microsoft.com/office/word/2023/wordml/word16du" xmlns:w16sdtdh="http://schemas.microsoft.com/office/word/2020/wordml/sdtdatahash" xmlns:w16se="http://schemas.microsoft.com/office/word/2015/wordml/symex" xmlns:wpg="http://schemas.microsoft.com/office/word/2010/wordprocessingGroup" xmlns:wpi="http://schemas.microsoft.com/office/word/2010/wordprocessingInk" xmlns:wne="http://schemas.microsoft.com/office/word/2006/wordml" xmlns:wps="http://schemas.microsoft.com/office/word/2010/wordprocessingShape" mc:Ignorable="w14 w15 w16se w16cid w16 w16cex w16sdtdh w16du wp14">
+<w:ftr xmlns:wpc="http://schemas.microsoft.com/office/word/2010/wordprocessingCanvas" xmlns:cx="http://schemas.microsoft.com/office/drawing/2014/chartex" xmlns:cx1="http://schemas.microsoft.com/office/drawing/2015/9/8/chartex" xmlns:cx2="http://schemas.microsoft.com/office/drawing/2015/10/21/chartex" xmlns:cx3="http://schemas.microsoft.com/office/drawing/2016/5/9/chartex" xmlns:cx4="http://schemas.microsoft.com/office/drawing/2016/5/10/chartex" xmlns:cx5="http://schemas.microsoft.com/office/drawing/2016/5/11/chartex" xmlns:cx6="http://schemas.microsoft.com/office/drawing/2016/5/12/chartex" xmlns:cx7="http://schemas.microsoft.com/office/drawing/2016/5/13/chartex" xmlns:cx8="http://schemas.microsoft.com/office/drawing/2016/5/14/chartex" xmlns:mc="http://schemas.openxmlformats.org/markup-compatibility/2006" xmlns:aink="http://schemas.microsoft.com/office/drawing/2016/ink" xmlns:am3d="http://schemas.microsoft.com/office/drawing/2017/model3d" xmlns:o="urn:schemas-microsoft-com:office:office" xmlns:r="http://schemas.openxmlformats.org/officeDocument/2006/relationships" xmlns:m="http://schemas.openxmlformats.org/officeDocument/2006/math" xmlns:v="urn:schemas-microsoft-com:vml" xmlns:wp14="http://schemas.microsoft.com/office/word/2010/wordprocessingDrawing" xmlns:wp="http://schemas.openxmlformats.org/drawingml/2006/wordprocessingDrawing" xmlns:w10="urn:schemas-microsoft-com:office:word" xmlns:w="http://schemas.openxmlformats.org/wordprocessingml/2006/main" xmlns:w14="http://schemas.microsoft.com/office/word/2010/wordml" xmlns:w15="http://schemas.microsoft.com/office/word/2012/wordml" xmlns:w16cex="http://schemas.microsoft.com/office/word/2018/wordml/cex" xmlns:w16cid="http://schemas.microsoft.com/office/word/2016/wordml/cid" xmlns:w16="http://schemas.microsoft.com/office/word/2018/wordml" xmlns:w16sdtdh="http://schemas.microsoft.com/office/word/2020/wordml/sdtdatahash" xmlns:w16se="http://schemas.microsoft.com/office/word/2015/wordml/symex" xmlns:wpg="http://schemas.microsoft.com/office/word/2010/wordprocessingGroup" xmlns:wpi="http://schemas.microsoft.com/office/word/2010/wordprocessingInk" xmlns:wne="http://schemas.microsoft.com/office/word/2006/wordml" xmlns:wps="http://schemas.microsoft.com/office/word/2010/wordprocessingShape" mc:Ignorable="w14 w15 w16se w16cid w16 w16cex w16sdtdh wp14">
   <w:p>
     <w:pPr>
       <w:pStyle w:val="Footer"/>
@@ -8376,7 +8525,7 @@
 </file>
 
 <file path=word/footnotes.xml><?xml version="1.0" encoding="utf-8"?>
-<w:footnotes xmlns:wpc="http://schemas.microsoft.com/office/word/2010/wordprocessingCanvas" xmlns:cx="http://schemas.microsoft.com/office/drawing/2014/chartex" xmlns:cx1="http://schemas.microsoft.com/office/drawing/2015/9/8/chartex" xmlns:cx2="http://schemas.microsoft.com/office/drawing/2015/10/21/chartex" xmlns:cx3="http://schemas.microsoft.com/office/drawing/2016/5/9/chartex" xmlns:cx4="http://schemas.microsoft.com/office/drawing/2016/5/10/chartex" xmlns:cx5="http://schemas.microsoft.com/office/drawing/2016/5/11/chartex" xmlns:cx6="http://schemas.microsoft.com/office/drawing/2016/5/12/chartex" xmlns:cx7="http://schemas.microsoft.com/office/drawing/2016/5/13/chartex" xmlns:cx8="http://schemas.microsoft.com/office/drawing/2016/5/14/chartex" xmlns:mc="http://schemas.openxmlformats.org/markup-compatibility/2006" xmlns:aink="http://schemas.microsoft.com/office/drawing/2016/ink" xmlns:am3d="http://schemas.microsoft.com/office/drawing/2017/model3d" xmlns:o="urn:schemas-microsoft-com:office:office" xmlns:oel="http://schemas.microsoft.com/office/2019/extlst" xmlns:r="http://schemas.openxmlformats.org/officeDocument/2006/relationships" xmlns:m="http://schemas.openxmlformats.org/officeDocument/2006/math" xmlns:v="urn:schemas-microsoft-com:vml" xmlns:wp14="http://schemas.microsoft.com/office/word/2010/wordprocessingDrawing" xmlns:wp="http://schemas.openxmlformats.org/drawingml/2006/wordprocessingDrawing" xmlns:w10="urn:schemas-microsoft-com:office:word" xmlns:w="http://schemas.openxmlformats.org/wordprocessingml/2006/main" xmlns:w14="http://schemas.microsoft.com/office/word/2010/wordml" xmlns:w15="http://schemas.microsoft.com/office/word/2012/wordml" xmlns:w16cex="http://schemas.microsoft.com/office/word/2018/wordml/cex" xmlns:w16cid="http://schemas.microsoft.com/office/word/2016/wordml/cid" xmlns:w16="http://schemas.microsoft.com/office/word/2018/wordml" xmlns:w16du="http://schemas.microsoft.com/office/word/2023/wordml/word16du" xmlns:w16sdtdh="http://schemas.microsoft.com/office/word/2020/wordml/sdtdatahash" xmlns:w16se="http://schemas.microsoft.com/office/word/2015/wordml/symex" xmlns:wpg="http://schemas.microsoft.com/office/word/2010/wordprocessingGroup" xmlns:wpi="http://schemas.microsoft.com/office/word/2010/wordprocessingInk" xmlns:wne="http://schemas.microsoft.com/office/word/2006/wordml" xmlns:wps="http://schemas.microsoft.com/office/word/2010/wordprocessingShape" mc:Ignorable="w14 w15 w16se w16cid w16 w16cex w16sdtdh w16du wp14">
+<w:footnotes xmlns:wpc="http://schemas.microsoft.com/office/word/2010/wordprocessingCanvas" xmlns:cx="http://schemas.microsoft.com/office/drawing/2014/chartex" xmlns:cx1="http://schemas.microsoft.com/office/drawing/2015/9/8/chartex" xmlns:cx2="http://schemas.microsoft.com/office/drawing/2015/10/21/chartex" xmlns:cx3="http://schemas.microsoft.com/office/drawing/2016/5/9/chartex" xmlns:cx4="http://schemas.microsoft.com/office/drawing/2016/5/10/chartex" xmlns:cx5="http://schemas.microsoft.com/office/drawing/2016/5/11/chartex" xmlns:cx6="http://schemas.microsoft.com/office/drawing/2016/5/12/chartex" xmlns:cx7="http://schemas.microsoft.com/office/drawing/2016/5/13/chartex" xmlns:cx8="http://schemas.microsoft.com/office/drawing/2016/5/14/chartex" xmlns:mc="http://schemas.openxmlformats.org/markup-compatibility/2006" xmlns:aink="http://schemas.microsoft.com/office/drawing/2016/ink" xmlns:am3d="http://schemas.microsoft.com/office/drawing/2017/model3d" xmlns:o="urn:schemas-microsoft-com:office:office" xmlns:r="http://schemas.openxmlformats.org/officeDocument/2006/relationships" xmlns:m="http://schemas.openxmlformats.org/officeDocument/2006/math" xmlns:v="urn:schemas-microsoft-com:vml" xmlns:wp14="http://schemas.microsoft.com/office/word/2010/wordprocessingDrawing" xmlns:wp="http://schemas.openxmlformats.org/drawingml/2006/wordprocessingDrawing" xmlns:w10="urn:schemas-microsoft-com:office:word" xmlns:w="http://schemas.openxmlformats.org/wordprocessingml/2006/main" xmlns:w14="http://schemas.microsoft.com/office/word/2010/wordml" xmlns:w15="http://schemas.microsoft.com/office/word/2012/wordml" xmlns:w16cex="http://schemas.microsoft.com/office/word/2018/wordml/cex" xmlns:w16cid="http://schemas.microsoft.com/office/word/2016/wordml/cid" xmlns:w16="http://schemas.microsoft.com/office/word/2018/wordml" xmlns:w16sdtdh="http://schemas.microsoft.com/office/word/2020/wordml/sdtdatahash" xmlns:w16se="http://schemas.microsoft.com/office/word/2015/wordml/symex" xmlns:wpg="http://schemas.microsoft.com/office/word/2010/wordprocessingGroup" xmlns:wpi="http://schemas.microsoft.com/office/word/2010/wordprocessingInk" xmlns:wne="http://schemas.microsoft.com/office/word/2006/wordml" xmlns:wps="http://schemas.microsoft.com/office/word/2010/wordprocessingShape" mc:Ignorable="w14 w15 w16se w16cid w16 w16cex w16sdtdh wp14">
   <w:footnote w:type="separator" w:id="-1">
     <w:p>
       <w:r>
@@ -8395,7 +8544,7 @@
 </file>
 
 <file path=word/header1.xml><?xml version="1.0" encoding="utf-8"?>
-<w:hdr xmlns:wpc="http://schemas.microsoft.com/office/word/2010/wordprocessingCanvas" xmlns:cx="http://schemas.microsoft.com/office/drawing/2014/chartex" xmlns:cx1="http://schemas.microsoft.com/office/drawing/2015/9/8/chartex" xmlns:cx2="http://schemas.microsoft.com/office/drawing/2015/10/21/chartex" xmlns:cx3="http://schemas.microsoft.com/office/drawing/2016/5/9/chartex" xmlns:cx4="http://schemas.microsoft.com/office/drawing/2016/5/10/chartex" xmlns:cx5="http://schemas.microsoft.com/office/drawing/2016/5/11/chartex" xmlns:cx6="http://schemas.microsoft.com/office/drawing/2016/5/12/chartex" xmlns:cx7="http://schemas.microsoft.com/office/drawing/2016/5/13/chartex" xmlns:cx8="http://schemas.microsoft.com/office/drawing/2016/5/14/chartex" xmlns:mc="http://schemas.openxmlformats.org/markup-compatibility/2006" xmlns:aink="http://schemas.microsoft.com/office/drawing/2016/ink" xmlns:am3d="http://schemas.microsoft.com/office/drawing/2017/model3d" xmlns:o="urn:schemas-microsoft-com:office:office" xmlns:oel="http://schemas.microsoft.com/office/2019/extlst" xmlns:r="http://schemas.openxmlformats.org/officeDocument/2006/relationships" xmlns:m="http://schemas.openxmlformats.org/officeDocument/2006/math" xmlns:v="urn:schemas-microsoft-com:vml" xmlns:wp14="http://schemas.microsoft.com/office/word/2010/wordprocessingDrawing" xmlns:wp="http://schemas.openxmlformats.org/drawingml/2006/wordprocessingDrawing" xmlns:w10="urn:schemas-microsoft-com:office:word" xmlns:w="http://schemas.openxmlformats.org/wordprocessingml/2006/main" xmlns:w14="http://schemas.microsoft.com/office/word/2010/wordml" xmlns:w15="http://schemas.microsoft.com/office/word/2012/wordml" xmlns:w16cex="http://schemas.microsoft.com/office/word/2018/wordml/cex" xmlns:w16cid="http://schemas.microsoft.com/office/word/2016/wordml/cid" xmlns:w16="http://schemas.microsoft.com/office/word/2018/wordml" xmlns:w16du="http://schemas.microsoft.com/office/word/2023/wordml/word16du" xmlns:w16sdtdh="http://schemas.microsoft.com/office/word/2020/wordml/sdtdatahash" xmlns:w16se="http://schemas.microsoft.com/office/word/2015/wordml/symex" xmlns:wpg="http://schemas.microsoft.com/office/word/2010/wordprocessingGroup" xmlns:wpi="http://schemas.microsoft.com/office/word/2010/wordprocessingInk" xmlns:wne="http://schemas.microsoft.com/office/word/2006/wordml" xmlns:wps="http://schemas.microsoft.com/office/word/2010/wordprocessingShape" mc:Ignorable="w14 w15 w16se w16cid w16 w16cex w16sdtdh w16du wp14">
+<w:hdr xmlns:wpc="http://schemas.microsoft.com/office/word/2010/wordprocessingCanvas" xmlns:cx="http://schemas.microsoft.com/office/drawing/2014/chartex" xmlns:cx1="http://schemas.microsoft.com/office/drawing/2015/9/8/chartex" xmlns:cx2="http://schemas.microsoft.com/office/drawing/2015/10/21/chartex" xmlns:cx3="http://schemas.microsoft.com/office/drawing/2016/5/9/chartex" xmlns:cx4="http://schemas.microsoft.com/office/drawing/2016/5/10/chartex" xmlns:cx5="http://schemas.microsoft.com/office/drawing/2016/5/11/chartex" xmlns:cx6="http://schemas.microsoft.com/office/drawing/2016/5/12/chartex" xmlns:cx7="http://schemas.microsoft.com/office/drawing/2016/5/13/chartex" xmlns:cx8="http://schemas.microsoft.com/office/drawing/2016/5/14/chartex" xmlns:mc="http://schemas.openxmlformats.org/markup-compatibility/2006" xmlns:aink="http://schemas.microsoft.com/office/drawing/2016/ink" xmlns:am3d="http://schemas.microsoft.com/office/drawing/2017/model3d" xmlns:o="urn:schemas-microsoft-com:office:office" xmlns:r="http://schemas.openxmlformats.org/officeDocument/2006/relationships" xmlns:m="http://schemas.openxmlformats.org/officeDocument/2006/math" xmlns:v="urn:schemas-microsoft-com:vml" xmlns:wp14="http://schemas.microsoft.com/office/word/2010/wordprocessingDrawing" xmlns:wp="http://schemas.openxmlformats.org/drawingml/2006/wordprocessingDrawing" xmlns:w10="urn:schemas-microsoft-com:office:word" xmlns:w="http://schemas.openxmlformats.org/wordprocessingml/2006/main" xmlns:w14="http://schemas.microsoft.com/office/word/2010/wordml" xmlns:w15="http://schemas.microsoft.com/office/word/2012/wordml" xmlns:w16cex="http://schemas.microsoft.com/office/word/2018/wordml/cex" xmlns:w16cid="http://schemas.microsoft.com/office/word/2016/wordml/cid" xmlns:w16="http://schemas.microsoft.com/office/word/2018/wordml" xmlns:w16sdtdh="http://schemas.microsoft.com/office/word/2020/wordml/sdtdatahash" xmlns:w16se="http://schemas.microsoft.com/office/word/2015/wordml/symex" xmlns:wpg="http://schemas.microsoft.com/office/word/2010/wordprocessingGroup" xmlns:wpi="http://schemas.microsoft.com/office/word/2010/wordprocessingInk" xmlns:wne="http://schemas.microsoft.com/office/word/2006/wordml" xmlns:wps="http://schemas.microsoft.com/office/word/2010/wordprocessingShape" mc:Ignorable="w14 w15 w16se w16cid w16 w16cex w16sdtdh wp14">
   <w:p>
     <w:pPr>
       <w:pStyle w:val="Header"/>
@@ -8410,7 +8559,7 @@
 </file>
 
 <file path=word/numbering.xml><?xml version="1.0" encoding="utf-8"?>
-<w:numbering xmlns:wpc="http://schemas.microsoft.com/office/word/2010/wordprocessingCanvas" xmlns:cx="http://schemas.microsoft.com/office/drawing/2014/chartex" xmlns:cx1="http://schemas.microsoft.com/office/drawing/2015/9/8/chartex" xmlns:cx2="http://schemas.microsoft.com/office/drawing/2015/10/21/chartex" xmlns:cx3="http://schemas.microsoft.com/office/drawing/2016/5/9/chartex" xmlns:cx4="http://schemas.microsoft.com/office/drawing/2016/5/10/chartex" xmlns:cx5="http://schemas.microsoft.com/office/drawing/2016/5/11/chartex" xmlns:cx6="http://schemas.microsoft.com/office/drawing/2016/5/12/chartex" xmlns:cx7="http://schemas.microsoft.com/office/drawing/2016/5/13/chartex" xmlns:cx8="http://schemas.microsoft.com/office/drawing/2016/5/14/chartex" xmlns:mc="http://schemas.openxmlformats.org/markup-compatibility/2006" xmlns:aink="http://schemas.microsoft.com/office/drawing/2016/ink" xmlns:am3d="http://schemas.microsoft.com/office/drawing/2017/model3d" xmlns:o="urn:schemas-microsoft-com:office:office" xmlns:oel="http://schemas.microsoft.com/office/2019/extlst" xmlns:r="http://schemas.openxmlformats.org/officeDocument/2006/relationships" xmlns:m="http://schemas.openxmlformats.org/officeDocument/2006/math" xmlns:v="urn:schemas-microsoft-com:vml" xmlns:wp14="http://schemas.microsoft.com/office/word/2010/wordprocessingDrawing" xmlns:wp="http://schemas.openxmlformats.org/drawingml/2006/wordprocessingDrawing" xmlns:w10="urn:schemas-microsoft-com:office:word" xmlns:w="http://schemas.openxmlformats.org/wordprocessingml/2006/main" xmlns:w14="http://schemas.microsoft.com/office/word/2010/wordml" xmlns:w15="http://schemas.microsoft.com/office/word/2012/wordml" xmlns:w16cex="http://schemas.microsoft.com/office/word/2018/wordml/cex" xmlns:w16cid="http://schemas.microsoft.com/office/word/2016/wordml/cid" xmlns:w16="http://schemas.microsoft.com/office/word/2018/wordml" xmlns:w16du="http://schemas.microsoft.com/office/word/2023/wordml/word16du" xmlns:w16sdtdh="http://schemas.microsoft.com/office/word/2020/wordml/sdtdatahash" xmlns:w16se="http://schemas.microsoft.com/office/word/2015/wordml/symex" xmlns:wpg="http://schemas.microsoft.com/office/word/2010/wordprocessingGroup" xmlns:wpi="http://schemas.microsoft.com/office/word/2010/wordprocessingInk" xmlns:wne="http://schemas.microsoft.com/office/word/2006/wordml" xmlns:wps="http://schemas.microsoft.com/office/word/2010/wordprocessingShape" mc:Ignorable="w14 w15 w16se w16cid w16 w16cex w16sdtdh w16du wp14">
+<w:numbering xmlns:wpc="http://schemas.microsoft.com/office/word/2010/wordprocessingCanvas" xmlns:cx="http://schemas.microsoft.com/office/drawing/2014/chartex" xmlns:cx1="http://schemas.microsoft.com/office/drawing/2015/9/8/chartex" xmlns:cx2="http://schemas.microsoft.com/office/drawing/2015/10/21/chartex" xmlns:cx3="http://schemas.microsoft.com/office/drawing/2016/5/9/chartex" xmlns:cx4="http://schemas.microsoft.com/office/drawing/2016/5/10/chartex" xmlns:cx5="http://schemas.microsoft.com/office/drawing/2016/5/11/chartex" xmlns:cx6="http://schemas.microsoft.com/office/drawing/2016/5/12/chartex" xmlns:cx7="http://schemas.microsoft.com/office/drawing/2016/5/13/chartex" xmlns:cx8="http://schemas.microsoft.com/office/drawing/2016/5/14/chartex" xmlns:mc="http://schemas.openxmlformats.org/markup-compatibility/2006" xmlns:aink="http://schemas.microsoft.com/office/drawing/2016/ink" xmlns:am3d="http://schemas.microsoft.com/office/drawing/2017/model3d" xmlns:o="urn:schemas-microsoft-com:office:office" xmlns:r="http://schemas.openxmlformats.org/officeDocument/2006/relationships" xmlns:m="http://schemas.openxmlformats.org/officeDocument/2006/math" xmlns:v="urn:schemas-microsoft-com:vml" xmlns:wp14="http://schemas.microsoft.com/office/word/2010/wordprocessingDrawing" xmlns:wp="http://schemas.openxmlformats.org/drawingml/2006/wordprocessingDrawing" xmlns:w10="urn:schemas-microsoft-com:office:word" xmlns:w="http://schemas.openxmlformats.org/wordprocessingml/2006/main" xmlns:w14="http://schemas.microsoft.com/office/word/2010/wordml" xmlns:w15="http://schemas.microsoft.com/office/word/2012/wordml" xmlns:w16cex="http://schemas.microsoft.com/office/word/2018/wordml/cex" xmlns:w16cid="http://schemas.microsoft.com/office/word/2016/wordml/cid" xmlns:w16="http://schemas.microsoft.com/office/word/2018/wordml" xmlns:w16sdtdh="http://schemas.microsoft.com/office/word/2020/wordml/sdtdatahash" xmlns:w16se="http://schemas.microsoft.com/office/word/2015/wordml/symex" xmlns:wpg="http://schemas.microsoft.com/office/word/2010/wordprocessingGroup" xmlns:wpi="http://schemas.microsoft.com/office/word/2010/wordprocessingInk" xmlns:wne="http://schemas.microsoft.com/office/word/2006/wordml" xmlns:wps="http://schemas.microsoft.com/office/word/2010/wordprocessingShape" mc:Ignorable="w14 w15 w16se w16cid w16 w16cex w16sdtdh wp14">
   <w:abstractNum w:abstractNumId="0" w15:restartNumberingAfterBreak="0">
     <w:nsid w:val="088D3CC1"/>
     <w:multiLevelType w:val="hybridMultilevel"/>
@@ -10007,49 +10156,49 @@
       </w:pPr>
     </w:lvl>
   </w:abstractNum>
-  <w:num w:numId="1" w16cid:durableId="862406290">
+  <w:num w:numId="1">
     <w:abstractNumId w:val="3"/>
   </w:num>
-  <w:num w:numId="2" w16cid:durableId="1202325455">
+  <w:num w:numId="2">
     <w:abstractNumId w:val="16"/>
   </w:num>
-  <w:num w:numId="3" w16cid:durableId="2115663607">
+  <w:num w:numId="3">
     <w:abstractNumId w:val="1"/>
   </w:num>
-  <w:num w:numId="4" w16cid:durableId="385571933">
+  <w:num w:numId="4">
     <w:abstractNumId w:val="4"/>
   </w:num>
-  <w:num w:numId="5" w16cid:durableId="276254126">
+  <w:num w:numId="5">
     <w:abstractNumId w:val="8"/>
   </w:num>
-  <w:num w:numId="6" w16cid:durableId="546767986">
+  <w:num w:numId="6">
     <w:abstractNumId w:val="2"/>
   </w:num>
-  <w:num w:numId="7" w16cid:durableId="264047000">
+  <w:num w:numId="7">
     <w:abstractNumId w:val="6"/>
   </w:num>
-  <w:num w:numId="8" w16cid:durableId="709500082">
+  <w:num w:numId="8">
     <w:abstractNumId w:val="10"/>
   </w:num>
-  <w:num w:numId="9" w16cid:durableId="418336305">
+  <w:num w:numId="9">
     <w:abstractNumId w:val="13"/>
   </w:num>
-  <w:num w:numId="10" w16cid:durableId="779952277">
+  <w:num w:numId="10">
     <w:abstractNumId w:val="12"/>
   </w:num>
-  <w:num w:numId="11" w16cid:durableId="159927382">
+  <w:num w:numId="11">
     <w:abstractNumId w:val="11"/>
   </w:num>
-  <w:num w:numId="12" w16cid:durableId="1380206939">
+  <w:num w:numId="12">
     <w:abstractNumId w:val="15"/>
   </w:num>
-  <w:num w:numId="13" w16cid:durableId="987245441">
+  <w:num w:numId="13">
     <w:abstractNumId w:val="0"/>
   </w:num>
-  <w:num w:numId="14" w16cid:durableId="1488984307">
+  <w:num w:numId="14">
     <w:abstractNumId w:val="9"/>
   </w:num>
-  <w:num w:numId="15" w16cid:durableId="1193105155">
+  <w:num w:numId="15">
     <w:abstractNumId w:val="1"/>
     <w:lvlOverride w:ilvl="0">
       <w:lvl w:ilvl="0" w:tplc="A1F0DF9A">
@@ -10154,16 +10303,16 @@
       </w:lvl>
     </w:lvlOverride>
   </w:num>
-  <w:num w:numId="16" w16cid:durableId="196698726">
+  <w:num w:numId="16">
     <w:abstractNumId w:val="5"/>
   </w:num>
-  <w:num w:numId="17" w16cid:durableId="782652357">
+  <w:num w:numId="17">
     <w:abstractNumId w:val="7"/>
   </w:num>
-  <w:num w:numId="18" w16cid:durableId="1455438853">
+  <w:num w:numId="18">
     <w:abstractNumId w:val="17"/>
   </w:num>
-  <w:num w:numId="19" w16cid:durableId="872114743">
+  <w:num w:numId="19">
     <w:abstractNumId w:val="14"/>
   </w:num>
   <w:numIdMacAtCleanup w:val="7"/>
@@ -10171,7 +10320,7 @@
 </file>
 
 <file path=word/styles.xml><?xml version="1.0" encoding="utf-8"?>
-<w:styles xmlns:mc="http://schemas.openxmlformats.org/markup-compatibility/2006" xmlns:r="http://schemas.openxmlformats.org/officeDocument/2006/relationships" xmlns:w="http://schemas.openxmlformats.org/wordprocessingml/2006/main" xmlns:w14="http://schemas.microsoft.com/office/word/2010/wordml" xmlns:w15="http://schemas.microsoft.com/office/word/2012/wordml" xmlns:w16cex="http://schemas.microsoft.com/office/word/2018/wordml/cex" xmlns:w16cid="http://schemas.microsoft.com/office/word/2016/wordml/cid" xmlns:w16="http://schemas.microsoft.com/office/word/2018/wordml" xmlns:w16du="http://schemas.microsoft.com/office/word/2023/wordml/word16du" xmlns:w16sdtdh="http://schemas.microsoft.com/office/word/2020/wordml/sdtdatahash" xmlns:w16se="http://schemas.microsoft.com/office/word/2015/wordml/symex" mc:Ignorable="w14 w15 w16se w16cid w16 w16cex w16sdtdh w16du">
+<w:styles xmlns:mc="http://schemas.openxmlformats.org/markup-compatibility/2006" xmlns:r="http://schemas.openxmlformats.org/officeDocument/2006/relationships" xmlns:w="http://schemas.openxmlformats.org/wordprocessingml/2006/main" xmlns:w14="http://schemas.microsoft.com/office/word/2010/wordml" xmlns:w15="http://schemas.microsoft.com/office/word/2012/wordml" xmlns:w16cex="http://schemas.microsoft.com/office/word/2018/wordml/cex" xmlns:w16cid="http://schemas.microsoft.com/office/word/2016/wordml/cid" xmlns:w16="http://schemas.microsoft.com/office/word/2018/wordml" xmlns:w16sdtdh="http://schemas.microsoft.com/office/word/2020/wordml/sdtdatahash" xmlns:w16se="http://schemas.microsoft.com/office/word/2015/wordml/symex" mc:Ignorable="w14 w15 w16se w16cid w16 w16cex w16sdtdh">
   <w:docDefaults>
     <w:rPrDefault>
       <w:rPr>

</xml_diff>